<commit_message>
Lake Como: rebuild package, report and Word file after re-tag
Co-Authored-By: Claude Opus 5.5 <noreply@anthropic.com>
Claude-Session: https://claude.ai/code/session_01EEvUWrVGGk2TNCAZgDpvtd
</commit_message>
<xml_diff>
--- a/content/posts/lake-como-villa-wedding-exclusive-use/lake-como-villa-wedding-exclusive-use-draft.docx
+++ b/content/posts/lake-como-villa-wedding-exclusive-use/lake-como-villa-wedding-exclusive-use-draft.docx
@@ -109,7 +109,7 @@
           <w:sz w:val="18"/>
           <w:szCs w:val="18"/>
         </w:rPr>
-        <w:t xml:space="preserve">1. [[VERIFY]] items (19, all still marked in the body):</w:t>
+        <w:t xml:space="preserve">1. [[VERIFY]] items (9, all still marked in the body):</w:t>
       </w:r>
     </w:p>
     <w:p>
@@ -127,7 +127,7 @@
           <w:highlight w:val="yellow"/>
           <w:highlightCs w:val="yellow"/>
         </w:rPr>
-        <w:t xml:space="preserve">[[VERIFY: minimum nights, check-in and check-out times, and set-up and breakdown windows for each villa]]</w:t>
+        <w:t xml:space="preserve">[[VERIFY: Nic sign-off on the Nulla Osta AUD 80 fee]]</w:t>
       </w:r>
     </w:p>
     <w:p>
@@ -145,7 +145,7 @@
           <w:highlight w:val="yellow"/>
           <w:highlightCs w:val="yellow"/>
         </w:rPr>
-        <w:t xml:space="preserve">[[VERIFY: curfew times and outdoor music rules for each villa on the couple's dates]]</w:t>
+        <w:t xml:space="preserve">[[VERIFY: Villa Sola Cabiati wedding terms, not on its own pages]]</w:t>
       </w:r>
     </w:p>
     <w:p>
@@ -163,7 +163,7 @@
           <w:highlight w:val="yellow"/>
           <w:highlightCs w:val="yellow"/>
         </w:rPr>
-        <w:t xml:space="preserve">[[VERIFY: in-house or approved-supplier rules for the remaining villas]]</w:t>
+        <w:t xml:space="preserve">[[VERIFY: Villa La Felice "no curfew" against local noise rules; comune, Pianello del Lario or near Menaggio]]</w:t>
       </w:r>
     </w:p>
     <w:p>
@@ -181,7 +181,7 @@
           <w:highlight w:val="yellow"/>
           <w:highlightCs w:val="yellow"/>
         </w:rPr>
-        <w:t xml:space="preserve">[[VERIFY: Nic sign-off on the Nulla Osta fee before publishing]]</w:t>
+        <w:t xml:space="preserve">[[VERIFY: Relais Villa Vittoria western-shore placement]]</w:t>
       </w:r>
     </w:p>
     <w:p>
@@ -199,7 +199,7 @@
           <w:highlight w:val="yellow"/>
           <w:highlightCs w:val="yellow"/>
         </w:rPr>
-        <w:t xml:space="preserve">[[VERIFY: Villa Balbiano: total guests sleeping on site and whether other buildings add rooms; seated and standing capacity; minimum nights; music curfew; civil or symbolic ceremony on site; indoor space for dinner and ceremony]]</w:t>
+        <w:t xml:space="preserve">[[VERIFY: Villa Pliniana room count, 17 or 18 bedrooms, 34 to about 40 guests]]</w:t>
       </w:r>
     </w:p>
     <w:p>
@@ -217,7 +217,7 @@
           <w:highlight w:val="yellow"/>
           <w:highlightCs w:val="yellow"/>
         </w:rPr>
-        <w:t xml:space="preserve">[[VERIFY: Villa Sola Cabiati, with Grand Hotel Tremezzo: wedding terms; seated and standing capacity; minimum nights; music curfew; civil or symbolic ceremony on site; whether the indoor rooms serve as the rain plan, and for how many]]</w:t>
+        <w:t xml:space="preserve">[[VERIFY: Villa Làrio eastern-shore placement]]</w:t>
       </w:r>
     </w:p>
     <w:p>
@@ -235,7 +235,7 @@
           <w:highlight w:val="yellow"/>
           <w:highlightCs w:val="yellow"/>
         </w:rPr>
-        <w:t xml:space="preserve">[[VERIFY: Villa La Felice: confirm in writing that "no curfew" holds under Pianello del Lario municipal noise rules for amplified music; minimum nights for a wedding booking; whether there is a private dock for boat arrivals or only a lakeside gate; street address, comune and drive time from Menaggio; maximum wedding guest numbers (12 sleeping, 30 ceremony, 14 dining) and the Celebration Weekend package guest count]]</w:t>
+        <w:t xml:space="preserve">[[VERIFY: Villa Aura del Lago whole estate exclusive during a wedding]]</w:t>
       </w:r>
     </w:p>
     <w:p>
@@ -253,7 +253,7 @@
           <w:highlight w:val="yellow"/>
           <w:highlightCs w:val="yellow"/>
         </w:rPr>
-        <w:t xml:space="preserve">[[VERIFY: Relais Villa Vittoria: western-shore placement from an official source; room count and beds; standing capacity; minimum nights; music curfew]]</w:t>
+        <w:t xml:space="preserve">[[VERIFY: Villa Cipressi civil-ceremony status, from a 2024 page]]</w:t>
       </w:r>
     </w:p>
     <w:p>
@@ -271,7 +271,7 @@
           <w:highlight w:val="yellow"/>
           <w:highlightCs w:val="yellow"/>
         </w:rPr>
-        <w:t xml:space="preserve">[[VERIFY: Villino Rubini: whether a civil (legally binding) ceremony can be held on site or only a symbolic garden ceremony; music curfew; standing capacity; whether the tent for about 100 guests is included or hired separately; coach access up the Brunate road for a wedding guest shuttle]]</w:t>
+        <w:t xml:space="preserve">[[VERIFY: Villa d'Este wedding buyout terms]]</w:t>
       </w:r>
     </w:p>
     <w:p>
@@ -280,16 +280,16 @@
           <w:sz w:val="18"/>
           <w:szCs w:val="18"/>
         </w:rPr>
-        <w:t xml:space="preserve">   - </w:t>
-      </w:r>
+        <w:t xml:space="preserve">2. Nic sign-off on prices:</w:t>
+      </w:r>
+    </w:p>
+    <w:p>
       <w:r>
         <w:rPr>
           <w:sz w:val="18"/>
           <w:szCs w:val="18"/>
-          <w:highlight w:val="yellow"/>
-          <w:highlightCs w:val="yellow"/>
-        </w:rPr>
-        <w:t xml:space="preserve">[[VERIFY: Villa Pliniana: current room count and guest capacity with Sereno Hotels; minimum nights; music curfew; civil or symbolic ceremony on site; indoor ceremony option]]</w:t>
+        </w:rPr>
+        <w:t xml:space="preserve">   - Nulla Osta fee: euro equivalent of AUD 80 per Australian citizen (Australian Embassy Rome). Government fee, not a venue price, but printed in the body.</w:t>
       </w:r>
     </w:p>
     <w:p>
@@ -298,16 +298,16 @@
           <w:sz w:val="18"/>
           <w:szCs w:val="18"/>
         </w:rPr>
-        <w:t xml:space="preserve">   - </w:t>
-      </w:r>
+        <w:t xml:space="preserve">3. Image slots needed (14, none approved yet; alt and caption to add when approved):</w:t>
+      </w:r>
+    </w:p>
+    <w:p>
       <w:r>
         <w:rPr>
           <w:sz w:val="18"/>
           <w:szCs w:val="18"/>
-          <w:highlight w:val="yellow"/>
-          <w:highlightCs w:val="yellow"/>
-        </w:rPr>
-        <w:t xml:space="preserve">[[VERIFY: Villa Làrio: eastern-shore placement; room count and guests sleeping on site; seated and standing capacity; minimum nights; music curfew; indoor capacity for dinner and ceremony]]</w:t>
+        </w:rPr>
+        <w:t xml:space="preserve">   - featured (needed)</w:t>
       </w:r>
     </w:p>
     <w:p>
@@ -316,16 +316,16 @@
           <w:sz w:val="18"/>
           <w:szCs w:val="18"/>
         </w:rPr>
-        <w:t xml:space="preserve">   - </w:t>
-      </w:r>
+        <w:t xml:space="preserve">   - exclusive-use-covers (needed)</w:t>
+      </w:r>
+    </w:p>
+    <w:p>
       <w:r>
         <w:rPr>
           <w:sz w:val="18"/>
           <w:szCs w:val="18"/>
-          <w:highlight w:val="yellow"/>
-          <w:highlightCs w:val="yellow"/>
-        </w:rPr>
-        <w:t xml:space="preserve">[[VERIFY: Villa Aura del Lago: whether the whole estate is exclusive during a wedding; standing capacity and marquee size; music curfew; whether a legal ceremony is possible on site; indoor ceremony option]]</w:t>
+        </w:rPr>
+        <w:t xml:space="preserve">   - villa-01 (needed)</w:t>
       </w:r>
     </w:p>
     <w:p>
@@ -334,16 +334,16 @@
           <w:sz w:val="18"/>
           <w:szCs w:val="18"/>
         </w:rPr>
-        <w:t xml:space="preserve">   - </w:t>
-      </w:r>
+        <w:t xml:space="preserve">   - villa-02 (needed)</w:t>
+      </w:r>
+    </w:p>
+    <w:p>
       <w:r>
         <w:rPr>
           <w:sz w:val="18"/>
           <w:szCs w:val="18"/>
-          <w:highlight w:val="yellow"/>
-          <w:highlightCs w:val="yellow"/>
-        </w:rPr>
-        <w:t xml:space="preserve">[[VERIFY: Villa Cipressi: room count; seated and standing capacity; exclusive-use minimum nights; music curfew and live music rules; current civil-ceremony status and whether non-residents can marry here; indoor capacity]]</w:t>
+        </w:rPr>
+        <w:t xml:space="preserve">   - villa-09 (needed)</w:t>
       </w:r>
     </w:p>
     <w:p>
@@ -352,16 +352,16 @@
           <w:sz w:val="18"/>
           <w:szCs w:val="18"/>
         </w:rPr>
-        <w:t xml:space="preserve">   - </w:t>
-      </w:r>
+        <w:t xml:space="preserve">   - villa-03 (needed)</w:t>
+      </w:r>
+    </w:p>
+    <w:p>
       <w:r>
         <w:rPr>
           <w:sz w:val="18"/>
           <w:szCs w:val="18"/>
-          <w:highlight w:val="yellow"/>
-          <w:highlightCs w:val="yellow"/>
-        </w:rPr>
-        <w:t xml:space="preserve">[[VERIFY: Villa Lario Resort: standing capacity; minimum nights; music curfew; indoor ceremony option]]</w:t>
+        </w:rPr>
+        <w:t xml:space="preserve">   - villa-10 (needed)</w:t>
       </w:r>
     </w:p>
     <w:p>
@@ -370,16 +370,16 @@
           <w:sz w:val="18"/>
           <w:szCs w:val="18"/>
         </w:rPr>
-        <w:t xml:space="preserve">   - </w:t>
-      </w:r>
+        <w:t xml:space="preserve">   - villa-04 (needed)</w:t>
+      </w:r>
+    </w:p>
+    <w:p>
       <w:r>
         <w:rPr>
           <w:sz w:val="18"/>
           <w:szCs w:val="18"/>
-          <w:highlight w:val="yellow"/>
-          <w:highlightCs w:val="yellow"/>
-        </w:rPr>
-        <w:t xml:space="preserve">[[VERIFY: Villa d'Este wedding buyout terms]]</w:t>
+        </w:rPr>
+        <w:t xml:space="preserve">   - villa-05 (needed)</w:t>
       </w:r>
     </w:p>
     <w:p>
@@ -388,16 +388,16 @@
           <w:sz w:val="18"/>
           <w:szCs w:val="18"/>
         </w:rPr>
-        <w:t xml:space="preserve">   - </w:t>
-      </w:r>
+        <w:t xml:space="preserve">   - villa-06 (needed)</w:t>
+      </w:r>
+    </w:p>
+    <w:p>
       <w:r>
         <w:rPr>
           <w:sz w:val="18"/>
           <w:szCs w:val="18"/>
-          <w:highlight w:val="yellow"/>
-          <w:highlightCs w:val="yellow"/>
-        </w:rPr>
-        <w:t xml:space="preserve">[[VERIFY: whether a legally binding civil ceremony can be held at Balbianello]]</w:t>
+        </w:rPr>
+        <w:t xml:space="preserve">   - villa-07 (needed)</w:t>
       </w:r>
     </w:p>
     <w:p>
@@ -406,16 +406,16 @@
           <w:sz w:val="18"/>
           <w:szCs w:val="18"/>
         </w:rPr>
-        <w:t xml:space="preserve">   - </w:t>
-      </w:r>
+        <w:t xml:space="preserve">   - villa-08 (needed)</w:t>
+      </w:r>
+    </w:p>
+    <w:p>
       <w:r>
         <w:rPr>
           <w:sz w:val="18"/>
           <w:szCs w:val="18"/>
-          <w:highlight w:val="yellow"/>
-          <w:highlightCs w:val="yellow"/>
-        </w:rPr>
-        <w:t xml:space="preserve">[[VERIFY: coach transfer times from Malpensa, Linate and Bergamo to each villa for the wedding date]]</w:t>
+        </w:rPr>
+        <w:t xml:space="preserve">   - getting-there-boat (needed)</w:t>
       </w:r>
     </w:p>
     <w:p>
@@ -424,16 +424,16 @@
           <w:sz w:val="18"/>
           <w:szCs w:val="18"/>
         </w:rPr>
-        <w:t xml:space="preserve">   - </w:t>
-      </w:r>
+        <w:t xml:space="preserve">   - guests-stay-town (needed)</w:t>
+      </w:r>
+    </w:p>
+    <w:p>
       <w:r>
         <w:rPr>
           <w:sz w:val="18"/>
           <w:szCs w:val="18"/>
-          <w:highlight w:val="yellow"/>
-          <w:highlightCs w:val="yellow"/>
-        </w:rPr>
-        <w:t xml:space="preserve">[[VERIFY: step-free access, lifts and accessible rooms at each shortlisted villa]]</w:t>
+        </w:rPr>
+        <w:t xml:space="preserve">4. Deferred business items (6, person's decision, not in this draft):</w:t>
       </w:r>
     </w:p>
     <w:p>
@@ -442,16 +442,16 @@
           <w:sz w:val="18"/>
           <w:szCs w:val="18"/>
         </w:rPr>
-        <w:t xml:space="preserve">   - </w:t>
-      </w:r>
+        <w:t xml:space="preserve">   - Fee model and commissions</w:t>
+      </w:r>
+    </w:p>
+    <w:p>
       <w:r>
         <w:rPr>
           <w:sz w:val="18"/>
           <w:szCs w:val="18"/>
-          <w:highlight w:val="yellow"/>
-          <w:highlightCs w:val="yellow"/>
-        </w:rPr>
-        <w:t xml:space="preserve">[[VERIFY: hotel-to-villa transfer times for each room-block town]]</w:t>
+        </w:rPr>
+        <w:t xml:space="preserve">   - Deposits, refunds and contracts</w:t>
       </w:r>
     </w:p>
     <w:p>
@@ -460,7 +460,7 @@
           <w:sz w:val="18"/>
           <w:szCs w:val="18"/>
         </w:rPr>
-        <w:t xml:space="preserve">2. Nic sign-off on prices:</w:t>
+        <w:t xml:space="preserve">   - "From AUD" price range</w:t>
       </w:r>
     </w:p>
     <w:p>
@@ -469,7 +469,7 @@
           <w:sz w:val="18"/>
           <w:szCs w:val="18"/>
         </w:rPr>
-        <w:t xml:space="preserve">   - Nulla Osta fee: "euro equivalent of AUD 80 per Australian citizen" (Australian Embassy Rome, fact_05). Government fee, not a venue price, but printed in the body so it needs Nic sign-off before publishing.</w:t>
+        <w:t xml:space="preserve">   - Wedded Privileges explanation</w:t>
       </w:r>
     </w:p>
     <w:p>
@@ -478,7 +478,7 @@
           <w:sz w:val="18"/>
           <w:szCs w:val="18"/>
         </w:rPr>
-        <w:t xml:space="preserve">3. Image slots needed (14; none approved, no licensed files yet, alt and caption to be written when each image is approved):</w:t>
+        <w:t xml:space="preserve">   - Named Wedded Advisor and phone line</w:t>
       </w:r>
     </w:p>
     <w:p>
@@ -487,7 +487,7 @@
           <w:sz w:val="18"/>
           <w:szCs w:val="18"/>
         </w:rPr>
-        <w:t xml:space="preserve">   - featured (featured): needed</w:t>
+        <w:t xml:space="preserve">   - Real wedding at a listed villa</w:t>
       </w:r>
     </w:p>
     <w:p>
@@ -496,196 +496,7 @@
           <w:sz w:val="18"/>
           <w:szCs w:val="18"/>
         </w:rPr>
-        <w:t xml:space="preserve">   - exclusive-use-covers (inline): needed</w:t>
-      </w:r>
-    </w:p>
-    <w:p>
-      <w:r>
-        <w:rPr>
-          <w:sz w:val="18"/>
-          <w:szCs w:val="18"/>
-        </w:rPr>
-        <w:t xml:space="preserve">   - villa-01 (inline): needed</w:t>
-      </w:r>
-    </w:p>
-    <w:p>
-      <w:r>
-        <w:rPr>
-          <w:sz w:val="18"/>
-          <w:szCs w:val="18"/>
-        </w:rPr>
-        <w:t xml:space="preserve">   - villa-02 (inline): needed</w:t>
-      </w:r>
-    </w:p>
-    <w:p>
-      <w:r>
-        <w:rPr>
-          <w:sz w:val="18"/>
-          <w:szCs w:val="18"/>
-        </w:rPr>
-        <w:t xml:space="preserve">   - villa-03 (inline): needed</w:t>
-      </w:r>
-    </w:p>
-    <w:p>
-      <w:r>
-        <w:rPr>
-          <w:sz w:val="18"/>
-          <w:szCs w:val="18"/>
-        </w:rPr>
-        <w:t xml:space="preserve">   - villa-04 (inline): needed</w:t>
-      </w:r>
-    </w:p>
-    <w:p>
-      <w:r>
-        <w:rPr>
-          <w:sz w:val="18"/>
-          <w:szCs w:val="18"/>
-        </w:rPr>
-        <w:t xml:space="preserve">   - villa-05 (inline): needed</w:t>
-      </w:r>
-    </w:p>
-    <w:p>
-      <w:r>
-        <w:rPr>
-          <w:sz w:val="18"/>
-          <w:szCs w:val="18"/>
-        </w:rPr>
-        <w:t xml:space="preserve">   - villa-06 (inline): needed</w:t>
-      </w:r>
-    </w:p>
-    <w:p>
-      <w:r>
-        <w:rPr>
-          <w:sz w:val="18"/>
-          <w:szCs w:val="18"/>
-        </w:rPr>
-        <w:t xml:space="preserve">   - villa-07 (inline): needed</w:t>
-      </w:r>
-    </w:p>
-    <w:p>
-      <w:r>
-        <w:rPr>
-          <w:sz w:val="18"/>
-          <w:szCs w:val="18"/>
-        </w:rPr>
-        <w:t xml:space="preserve">   - villa-08 (inline): needed</w:t>
-      </w:r>
-    </w:p>
-    <w:p>
-      <w:r>
-        <w:rPr>
-          <w:sz w:val="18"/>
-          <w:szCs w:val="18"/>
-        </w:rPr>
-        <w:t xml:space="preserve">   - getting-there-boat (inline): needed</w:t>
-      </w:r>
-    </w:p>
-    <w:p>
-      <w:r>
-        <w:rPr>
-          <w:sz w:val="18"/>
-          <w:szCs w:val="18"/>
-        </w:rPr>
-        <w:t xml:space="preserve">   - guests-stay-town (inline): needed</w:t>
-      </w:r>
-    </w:p>
-    <w:p>
-      <w:r>
-        <w:rPr>
-          <w:sz w:val="18"/>
-          <w:szCs w:val="18"/>
-        </w:rPr>
-        <w:t xml:space="preserve">   - villa-09 (inline): needed</w:t>
-      </w:r>
-    </w:p>
-    <w:p>
-      <w:r>
-        <w:rPr>
-          <w:sz w:val="18"/>
-          <w:szCs w:val="18"/>
-        </w:rPr>
-        <w:t xml:space="preserve">   - villa-10 (inline): needed</w:t>
-      </w:r>
-    </w:p>
-    <w:p>
-      <w:r>
-        <w:rPr>
-          <w:sz w:val="18"/>
-          <w:szCs w:val="18"/>
-        </w:rPr>
-        <w:t xml:space="preserve">4. DEFERRED business items (person chose to skip for this draft; no copy or VERIFY markers added for them):</w:t>
-      </w:r>
-    </w:p>
-    <w:p>
-      <w:r>
-        <w:rPr>
-          <w:sz w:val="18"/>
-          <w:szCs w:val="18"/>
-        </w:rPr>
-        <w:t xml:space="preserve">   - Fee model and commissions</w:t>
-      </w:r>
-    </w:p>
-    <w:p>
-      <w:r>
-        <w:rPr>
-          <w:sz w:val="18"/>
-          <w:szCs w:val="18"/>
-        </w:rPr>
-        <w:t xml:space="preserve">   - Deposits, refunds and contracts</w:t>
-      </w:r>
-    </w:p>
-    <w:p>
-      <w:r>
-        <w:rPr>
-          <w:sz w:val="18"/>
-          <w:szCs w:val="18"/>
-        </w:rPr>
-        <w:t xml:space="preserve">   - "From AUD" price range</w:t>
-      </w:r>
-    </w:p>
-    <w:p>
-      <w:r>
-        <w:rPr>
-          <w:sz w:val="18"/>
-          <w:szCs w:val="18"/>
-        </w:rPr>
-        <w:t xml:space="preserve">   - Wedded Privileges explanation</w:t>
-      </w:r>
-    </w:p>
-    <w:p>
-      <w:r>
-        <w:rPr>
-          <w:sz w:val="18"/>
-          <w:szCs w:val="18"/>
-        </w:rPr>
-        <w:t xml:space="preserve">   - Named Wedded Advisor and phone line</w:t>
-      </w:r>
-    </w:p>
-    <w:p>
-      <w:r>
-        <w:rPr>
-          <w:sz w:val="18"/>
-          <w:szCs w:val="18"/>
-        </w:rPr>
-        <w:t xml:space="preserve">   - Real wedding at a listed villa</w:t>
-      </w:r>
-    </w:p>
-    <w:p>
-      <w:r>
-        <w:rPr>
-          <w:sz w:val="18"/>
-          <w:szCs w:val="18"/>
-        </w:rPr>
-        <w:t xml:space="preserve">Author field: no named author in the inputs; set to "Wedded Wonderland" pending confirmation.</w:t>
-      </w:r>
-    </w:p>
-    <w:p>
-      <w:r>
-        <w:rPr>
-          <w:sz w:val="18"/>
-          <w:szCs w:val="18"/>
-        </w:rPr>
-        <w:t xml:space="preserve">Never Publish or Schedule from the pipeline. A human publishes.</w:t>
+        <w:t xml:space="preserve">Booking checklist (not publishing blockers): see booking-checklist.md</w:t>
       </w:r>
     </w:p>
     <w:p>
@@ -768,7 +579,7 @@
       <w:r>
         <w:t xml:space="preserve">This guide covers ten villas whose owners or operators confirm exclusive use on their own websites, with the same checks for each: who sleeps on site, how many you can seat, and the house rules to confirm. For the wider picture, see </w:t>
       </w:r>
-      <w:hyperlink w:history="1" r:id="rIdmtdzeqxthbbprih67ccaq">
+      <w:hyperlink w:history="1" r:id="rIdy0ykhpjit238imgeo6gxg">
         <w:r>
           <w:rPr>
             <w:rStyle w:val="Hyperlink"/>
@@ -801,7 +612,7 @@
       <w:r>
         <w:t xml:space="preserve">Ten villas on our shortlist could be confirmed as bookable for exclusive use from their own official sources. Several are boutique hotels that offer a whole-property option rather than private homes. None publishes an exclusive-use fee, so start with </w:t>
       </w:r>
-      <w:hyperlink w:history="1" r:id="rIdkumbjmtlctbtru1m3poeq">
+      <w:hyperlink w:history="1" r:id="rIdspsxaayrkpcymkazyxqw-">
         <w:r>
           <w:rPr>
             <w:rStyle w:val="Hyperlink"/>
@@ -973,14 +784,7 @@
         <w:spacing w:after="140"/>
       </w:pPr>
       <w:r>
-        <w:t xml:space="preserve">Of the ten villas, only two publish a minimum stay, both three nights: Villa Aura del Lago for weddings, and Villino Rubini for exclusive hire all year. Villa La Felice's Intimate Wedding package is three nights, though the villa does not state it as a minimum. Build the weekend around three nights: welcome evening, wedding, farewell lunch. The others do not publish a minimum stay or set-up windows. </w:t>
-      </w:r>
-      <w:r>
-        <w:rPr>
-          <w:highlight w:val="yellow"/>
-          <w:highlightCs w:val="yellow"/>
-        </w:rPr>
-        <w:t xml:space="preserve">[[VERIFY: minimum nights, check-in and check-out times, and set-up and breakdown windows for each villa]]</w:t>
+        <w:t xml:space="preserve">Of the ten villas, only two publish a minimum stay, both three nights: Villa Aura del Lago for weddings, and Villino Rubini for exclusive hire all year. Villa La Felice's Intimate Wedding package is three nights, though the villa does not state it as a minimum. Build the weekend around three nights: welcome evening, wedding, farewell lunch. The others do not publish a minimum stay, check-in times or set-up windows; your Wedded Advisor confirms them in writing for your dates.</w:t>
       </w:r>
     </w:p>
     <w:p>
@@ -996,17 +800,7 @@
         <w:spacing w:after="140"/>
       </w:pPr>
       <w:r>
-        <w:t xml:space="preserve">Only Villa La Felice addresses it: its weddings page says there is no curfew. None of the others publishes a curfew time. </w:t>
-      </w:r>
-      <w:r>
-        <w:rPr>
-          <w:highlight w:val="yellow"/>
-          <w:highlightCs w:val="yellow"/>
-        </w:rPr>
-        <w:t xml:space="preserve">[[VERIFY: curfew times and outdoor music rules for each villa on the couple's dates]]</w:t>
-      </w:r>
-      <w:r>
-        <w:t xml:space="preserve"> At Relais Villa Vittoria, the rock-cut wine cellar, La Barrique, becomes a private disco only when you hire the entire villa.</w:t>
+        <w:t xml:space="preserve">Only Villa La Felice addresses it: its weddings page says there is no curfew. None of the others publishes a curfew time; your Wedded Advisor confirms curfew and music rules in writing. At Relais Villa Vittoria, the rock-cut wine cellar, La Barrique, becomes a private disco only when you hire the entire villa.</w:t>
       </w:r>
     </w:p>
     <w:p>
@@ -1022,19 +816,9 @@
         <w:spacing w:after="140"/>
       </w:pPr>
       <w:r>
-        <w:t xml:space="preserve">Catering is often fixed. Villa Lario Resort's wedding menus come from its own Amandus Ristorante. Villa Aura del Lago works with one appointed banqueting and music partner. Ask whether outside suppliers are allowed, and on what terms. </w:t>
-      </w:r>
-      <w:r>
-        <w:rPr>
-          <w:highlight w:val="yellow"/>
-          <w:highlightCs w:val="yellow"/>
-        </w:rPr>
-        <w:t xml:space="preserve">[[VERIFY: in-house or approved-supplier rules for the remaining villas]]</w:t>
-      </w:r>
-      <w:r>
-        <w:t xml:space="preserve"> For how this fits into a full plan, see </w:t>
-      </w:r>
-      <w:hyperlink w:history="1" r:id="rIddhsf3hbi75tnxmgspighs">
+        <w:t xml:space="preserve">Catering is often fixed. Villa Lario Resort's wedding menus come from its own Amandus Ristorante. Villa Aura del Lago works with one appointed banqueting and music partner. The others do not publish supplier rules; your Wedded Advisor confirms in writing whether outside suppliers are allowed, and on what terms. For how this fits into a full plan, see </w:t>
+      </w:r>
+      <w:hyperlink w:history="1" r:id="rIdgyfugm3pxfpdxycgkp3m6">
         <w:r>
           <w:rPr>
             <w:rStyle w:val="Hyperlink"/>
@@ -1084,12 +868,12 @@
           <w:highlight w:val="yellow"/>
           <w:highlightCs w:val="yellow"/>
         </w:rPr>
-        <w:t xml:space="preserve">[[VERIFY: Nic sign-off on the Nulla Osta fee before publishing]]</w:t>
+        <w:t xml:space="preserve">[[VERIFY: Nic sign-off on the Nulla Osta AUD 80 fee]]</w:t>
       </w:r>
       <w:r>
         <w:t xml:space="preserve"> Between May and September, appointments with the celebrant and for the Apostille can be hard to get. Your Wedded Advisor confirms current requirements. Read </w:t>
       </w:r>
-      <w:hyperlink w:history="1" r:id="rIdhnccluctsct_q0xs3jlpo">
+      <w:hyperlink w:history="1" r:id="rIdk6ldwt01nl-mflfv6axtk">
         <w:r>
           <w:rPr>
             <w:rStyle w:val="Hyperlink"/>
@@ -1102,7 +886,7 @@
       <w:r>
         <w:t xml:space="preserve"> and </w:t>
       </w:r>
-      <w:hyperlink w:history="1" r:id="rIdyhlo2wfhvd03v2adgmjxl">
+      <w:hyperlink w:history="1" r:id="rId5nftjfibzzzjteqwziobs">
         <w:r>
           <w:rPr>
             <w:rStyle w:val="Hyperlink"/>
@@ -1115,7 +899,7 @@
       <w:r>
         <w:t xml:space="preserve">, along with </w:t>
       </w:r>
-      <w:hyperlink w:history="1" r:id="rIdg2g0bhe98au-qmvzoftbk">
+      <w:hyperlink w:history="1" r:id="rIdfjt3hgtmpf6ufb3f-tj-y">
         <w:r>
           <w:rPr>
             <w:rStyle w:val="Hyperlink"/>
@@ -1225,7 +1009,7 @@
       <w:r>
         <w:t xml:space="preserve">The owner, The Heritage Collection, lists </w:t>
       </w:r>
-      <w:hyperlink w:history="1" r:id="rIds-ww1s9-pe2r9zx2hdcsa">
+      <w:hyperlink w:history="1" r:id="rId5tc4rlldxoubnbeufri9w">
         <w:r>
           <w:rPr>
             <w:rStyle w:val="Hyperlink"/>
@@ -1238,7 +1022,7 @@
       <w:r>
         <w:t xml:space="preserve"> for private rental and offers it for events including destination weddings. See our </w:t>
       </w:r>
-      <w:hyperlink w:history="1" r:id="rId94y93isl8o6ng7vijdqja">
+      <w:hyperlink w:history="1" r:id="rId0y_wzukiea3kunedas2ho">
         <w:r>
           <w:rPr>
             <w:rStyle w:val="Hyperlink"/>
@@ -1325,14 +1109,7 @@
         <w:t xml:space="preserve">Not published:</w:t>
       </w:r>
       <w:r>
-        <w:t xml:space="preserve"> total guests sleeping on site, event capacity, minimum nights, curfew, ceremony type, wet-weather plan. </w:t>
-      </w:r>
-      <w:r>
-        <w:rPr>
-          <w:highlight w:val="yellow"/>
-          <w:highlightCs w:val="yellow"/>
-        </w:rPr>
-        <w:t xml:space="preserve">[[VERIFY: Villa Balbiano: total guests sleeping on site and whether other buildings add rooms; seated and standing capacity; minimum nights; music curfew; civil or symbolic ceremony on site; indoor space for dinner and ceremony]]</w:t>
+        <w:t xml:space="preserve"> total guests sleeping on site, event capacity, minimum nights, curfew, ceremony type, wet-weather plan.</w:t>
       </w:r>
     </w:p>
     <w:p>
@@ -1515,7 +1292,7 @@
           <w:highlight w:val="yellow"/>
           <w:highlightCs w:val="yellow"/>
         </w:rPr>
-        <w:t xml:space="preserve">[[VERIFY: Villa Sola Cabiati, with Grand Hotel Tremezzo: wedding terms; seated and standing capacity; minimum nights; music curfew; civil or symbolic ceremony on site; whether the indoor rooms serve as the rain plan, and for how many]]</w:t>
+        <w:t xml:space="preserve">[[VERIFY: Villa Sola Cabiati wedding terms, not on its own pages]]</w:t>
       </w:r>
     </w:p>
     <w:p>
@@ -1774,7 +1551,7 @@
           <w:highlight w:val="yellow"/>
           <w:highlightCs w:val="yellow"/>
         </w:rPr>
-        <w:t xml:space="preserve">[[VERIFY: Villa La Felice: confirm in writing that "no curfew" holds under Pianello del Lario municipal noise rules for amplified music; minimum nights for a wedding booking; whether there is a private dock for boat arrivals or only a lakeside gate; street address, comune and drive time from Menaggio; maximum wedding guest numbers (12 sleeping, 30 ceremony, 14 dining) and the Celebration Weekend package guest count]]</w:t>
+        <w:t xml:space="preserve">[[VERIFY: Villa La Felice "no curfew" against local noise rules; comune, Pianello del Lario or near Menaggio]]</w:t>
       </w:r>
     </w:p>
     <w:p>
@@ -2014,7 +1791,7 @@
           <w:highlight w:val="yellow"/>
           <w:highlightCs w:val="yellow"/>
         </w:rPr>
-        <w:t xml:space="preserve">[[VERIFY: Relais Villa Vittoria: western-shore placement from an official source; room count and beds; standing capacity; minimum nights; music curfew]]</w:t>
+        <w:t xml:space="preserve">[[VERIFY: Relais Villa Vittoria western-shore placement]]</w:t>
       </w:r>
     </w:p>
     <w:p>
@@ -2247,14 +2024,7 @@
         <w:t xml:space="preserve">Not published:</w:t>
       </w:r>
       <w:r>
-        <w:t xml:space="preserve"> civil ceremony, curfew, standing capacity, tent terms, coach access. </w:t>
-      </w:r>
-      <w:r>
-        <w:rPr>
-          <w:highlight w:val="yellow"/>
-          <w:highlightCs w:val="yellow"/>
-        </w:rPr>
-        <w:t xml:space="preserve">[[VERIFY: Villino Rubini: whether a civil (legally binding) ceremony can be held on site or only a symbolic garden ceremony; music curfew; standing capacity; whether the tent for about 100 guests is included or hired separately; coach access up the Brunate road for a wedding guest shuttle]]</w:t>
+        <w:t xml:space="preserve"> civil ceremony, curfew, standing capacity, tent terms, coach access.</w:t>
       </w:r>
     </w:p>
     <w:p>
@@ -2373,90 +2143,90 @@
         <w:t xml:space="preserve">Sleeps on site:</w:t>
       </w:r>
       <w:r>
-        <w:t xml:space="preserve"> Sereno's own pages differ: 17 or 18 bedrooms, sleeping from 34 to about 40 guests.</w:t>
-      </w:r>
-    </w:p>
-    <w:p>
-      <w:pPr>
-        <w:pStyle w:val="ListParagraph"/>
-        <w:numPr>
-          <w:ilvl w:val="0"/>
-          <w:numId w:val="2"/>
-        </w:numPr>
-      </w:pPr>
-      <w:r>
-        <w:rPr>
-          <w:b/>
-          <w:bCs/>
-        </w:rPr>
-        <w:t xml:space="preserve">Event capacity:</w:t>
-      </w:r>
-      <w:r>
-        <w:t xml:space="preserve"> Up to 200 seated for dinner in the ballrooms; the waterfront gardens host up to 500.</w:t>
-      </w:r>
-    </w:p>
-    <w:p>
-      <w:pPr>
-        <w:pStyle w:val="ListParagraph"/>
-        <w:numPr>
-          <w:ilvl w:val="0"/>
-          <w:numId w:val="2"/>
-        </w:numPr>
-      </w:pPr>
-      <w:r>
-        <w:rPr>
-          <w:b/>
-          <w:bCs/>
-        </w:rPr>
-        <w:t xml:space="preserve">Dock and boats:</w:t>
-      </w:r>
-      <w:r>
-        <w:t xml:space="preserve"> A private boat dock with safe harbouring, plus an on-site helipad.</w:t>
-      </w:r>
-    </w:p>
-    <w:p>
-      <w:pPr>
-        <w:pStyle w:val="ListParagraph"/>
-        <w:numPr>
-          <w:ilvl w:val="0"/>
-          <w:numId w:val="2"/>
-        </w:numPr>
-      </w:pPr>
-      <w:r>
-        <w:rPr>
-          <w:b/>
-          <w:bCs/>
-        </w:rPr>
-        <w:t xml:space="preserve">Wet weather:</w:t>
-      </w:r>
-      <w:r>
-        <w:t xml:space="preserve"> The ballrooms seat 200 for dinner.</w:t>
-      </w:r>
-    </w:p>
-    <w:p>
-      <w:pPr>
-        <w:pStyle w:val="ListParagraph"/>
-        <w:numPr>
-          <w:ilvl w:val="0"/>
-          <w:numId w:val="2"/>
-        </w:numPr>
-      </w:pPr>
-      <w:r>
-        <w:rPr>
-          <w:b/>
-          <w:bCs/>
-        </w:rPr>
-        <w:t xml:space="preserve">Not published:</w:t>
-      </w:r>
-      <w:r>
-        <w:t xml:space="preserve"> minimum nights, curfew, ceremony type, indoor ceremony option. </w:t>
+        <w:t xml:space="preserve"> Sereno's own pages differ: 17 or 18 bedrooms, sleeping from 34 to about 40 guests. </w:t>
       </w:r>
       <w:r>
         <w:rPr>
           <w:highlight w:val="yellow"/>
           <w:highlightCs w:val="yellow"/>
         </w:rPr>
-        <w:t xml:space="preserve">[[VERIFY: Villa Pliniana: current room count and guest capacity with Sereno Hotels; minimum nights; music curfew; civil or symbolic ceremony on site; indoor ceremony option]]</w:t>
+        <w:t xml:space="preserve">[[VERIFY: Villa Pliniana room count, 17 or 18 bedrooms, 34 to about 40 guests]]</w:t>
+      </w:r>
+    </w:p>
+    <w:p>
+      <w:pPr>
+        <w:pStyle w:val="ListParagraph"/>
+        <w:numPr>
+          <w:ilvl w:val="0"/>
+          <w:numId w:val="2"/>
+        </w:numPr>
+      </w:pPr>
+      <w:r>
+        <w:rPr>
+          <w:b/>
+          <w:bCs/>
+        </w:rPr>
+        <w:t xml:space="preserve">Event capacity:</w:t>
+      </w:r>
+      <w:r>
+        <w:t xml:space="preserve"> Up to 200 seated for dinner in the ballrooms; the waterfront gardens host up to 500.</w:t>
+      </w:r>
+    </w:p>
+    <w:p>
+      <w:pPr>
+        <w:pStyle w:val="ListParagraph"/>
+        <w:numPr>
+          <w:ilvl w:val="0"/>
+          <w:numId w:val="2"/>
+        </w:numPr>
+      </w:pPr>
+      <w:r>
+        <w:rPr>
+          <w:b/>
+          <w:bCs/>
+        </w:rPr>
+        <w:t xml:space="preserve">Dock and boats:</w:t>
+      </w:r>
+      <w:r>
+        <w:t xml:space="preserve"> A private boat dock with safe harbouring, plus an on-site helipad.</w:t>
+      </w:r>
+    </w:p>
+    <w:p>
+      <w:pPr>
+        <w:pStyle w:val="ListParagraph"/>
+        <w:numPr>
+          <w:ilvl w:val="0"/>
+          <w:numId w:val="2"/>
+        </w:numPr>
+      </w:pPr>
+      <w:r>
+        <w:rPr>
+          <w:b/>
+          <w:bCs/>
+        </w:rPr>
+        <w:t xml:space="preserve">Wet weather:</w:t>
+      </w:r>
+      <w:r>
+        <w:t xml:space="preserve"> The ballrooms seat 200 for dinner.</w:t>
+      </w:r>
+    </w:p>
+    <w:p>
+      <w:pPr>
+        <w:pStyle w:val="ListParagraph"/>
+        <w:numPr>
+          <w:ilvl w:val="0"/>
+          <w:numId w:val="2"/>
+        </w:numPr>
+      </w:pPr>
+      <w:r>
+        <w:rPr>
+          <w:b/>
+          <w:bCs/>
+        </w:rPr>
+        <w:t xml:space="preserve">Not published:</w:t>
+      </w:r>
+      <w:r>
+        <w:t xml:space="preserve"> minimum nights, curfew, ceremony type, indoor ceremony option.</w:t>
       </w:r>
     </w:p>
     <w:p>
@@ -2658,7 +2428,7 @@
           <w:highlight w:val="yellow"/>
           <w:highlightCs w:val="yellow"/>
         </w:rPr>
-        <w:t xml:space="preserve">[[VERIFY: Villa Làrio: eastern-shore placement; room count and guests sleeping on site; seated and standing capacity; minimum nights; music curfew; indoor capacity for dinner and ceremony]]</w:t>
+        <w:t xml:space="preserve">[[VERIFY: Villa Làrio eastern-shore placement]]</w:t>
       </w:r>
     </w:p>
     <w:p>
@@ -2898,7 +2668,7 @@
           <w:highlight w:val="yellow"/>
           <w:highlightCs w:val="yellow"/>
         </w:rPr>
-        <w:t xml:space="preserve">[[VERIFY: Villa Aura del Lago: whether the whole estate is exclusive during a wedding; standing capacity and marquee size; music curfew; whether a legal ceremony is possible on site; indoor ceremony option]]</w:t>
+        <w:t xml:space="preserve">[[VERIFY: Villa Aura del Lago whole estate exclusive during a wedding]]</w:t>
       </w:r>
     </w:p>
     <w:p>
@@ -3055,71 +2825,71 @@
         <w:t xml:space="preserve">Ceremony:</w:t>
       </w:r>
       <w:r>
-        <w:t xml:space="preserve"> Civil, with a caveat. Varenna's tourism site lists Villa Cipressi as one of the town's civil-ceremony locations, on a page last updated in July 2024.</w:t>
-      </w:r>
-    </w:p>
-    <w:p>
-      <w:pPr>
-        <w:pStyle w:val="ListParagraph"/>
-        <w:numPr>
-          <w:ilvl w:val="0"/>
-          <w:numId w:val="2"/>
-        </w:numPr>
-      </w:pPr>
-      <w:r>
-        <w:rPr>
-          <w:b/>
-          <w:bCs/>
-        </w:rPr>
-        <w:t xml:space="preserve">Dock and boats:</w:t>
-      </w:r>
-      <w:r>
-        <w:t xml:space="preserve"> Boats can be hired and moored at a private dock.</w:t>
-      </w:r>
-    </w:p>
-    <w:p>
-      <w:pPr>
-        <w:pStyle w:val="ListParagraph"/>
-        <w:numPr>
-          <w:ilvl w:val="0"/>
-          <w:numId w:val="2"/>
-        </w:numPr>
-      </w:pPr>
-      <w:r>
-        <w:rPr>
-          <w:b/>
-          <w:bCs/>
-        </w:rPr>
-        <w:t xml:space="preserve">Wet weather:</w:t>
-      </w:r>
-      <w:r>
-        <w:t xml:space="preserve"> Three reception rooms with frescoes from the 1400s, large fireplaces and crystal chandeliers.</w:t>
-      </w:r>
-    </w:p>
-    <w:p>
-      <w:pPr>
-        <w:pStyle w:val="ListParagraph"/>
-        <w:numPr>
-          <w:ilvl w:val="0"/>
-          <w:numId w:val="2"/>
-        </w:numPr>
-      </w:pPr>
-      <w:r>
-        <w:rPr>
-          <w:b/>
-          <w:bCs/>
-        </w:rPr>
-        <w:t xml:space="preserve">Not published:</w:t>
-      </w:r>
-      <w:r>
-        <w:t xml:space="preserve"> room count, event capacity, minimum nights, curfew, reception-room capacity. </w:t>
+        <w:t xml:space="preserve"> Civil, with a caveat. Varenna's tourism site lists Villa Cipressi as one of the town's civil-ceremony locations, on a page last updated in July 2024. </w:t>
       </w:r>
       <w:r>
         <w:rPr>
           <w:highlight w:val="yellow"/>
           <w:highlightCs w:val="yellow"/>
         </w:rPr>
-        <w:t xml:space="preserve">[[VERIFY: Villa Cipressi: room count; seated and standing capacity; exclusive-use minimum nights; music curfew and live music rules; current civil-ceremony status and whether non-residents can marry here; indoor capacity]]</w:t>
+        <w:t xml:space="preserve">[[VERIFY: Villa Cipressi civil-ceremony status, from a 2024 page]]</w:t>
+      </w:r>
+    </w:p>
+    <w:p>
+      <w:pPr>
+        <w:pStyle w:val="ListParagraph"/>
+        <w:numPr>
+          <w:ilvl w:val="0"/>
+          <w:numId w:val="2"/>
+        </w:numPr>
+      </w:pPr>
+      <w:r>
+        <w:rPr>
+          <w:b/>
+          <w:bCs/>
+        </w:rPr>
+        <w:t xml:space="preserve">Dock and boats:</w:t>
+      </w:r>
+      <w:r>
+        <w:t xml:space="preserve"> Boats can be hired and moored at a private dock.</w:t>
+      </w:r>
+    </w:p>
+    <w:p>
+      <w:pPr>
+        <w:pStyle w:val="ListParagraph"/>
+        <w:numPr>
+          <w:ilvl w:val="0"/>
+          <w:numId w:val="2"/>
+        </w:numPr>
+      </w:pPr>
+      <w:r>
+        <w:rPr>
+          <w:b/>
+          <w:bCs/>
+        </w:rPr>
+        <w:t xml:space="preserve">Wet weather:</w:t>
+      </w:r>
+      <w:r>
+        <w:t xml:space="preserve"> Three reception rooms with frescoes from the 1400s, large fireplaces and crystal chandeliers.</w:t>
+      </w:r>
+    </w:p>
+    <w:p>
+      <w:pPr>
+        <w:pStyle w:val="ListParagraph"/>
+        <w:numPr>
+          <w:ilvl w:val="0"/>
+          <w:numId w:val="2"/>
+        </w:numPr>
+      </w:pPr>
+      <w:r>
+        <w:rPr>
+          <w:b/>
+          <w:bCs/>
+        </w:rPr>
+        <w:t xml:space="preserve">Not published:</w:t>
+      </w:r>
+      <w:r>
+        <w:t xml:space="preserve"> room count, event capacity, minimum nights, curfew, reception-room capacity.</w:t>
       </w:r>
     </w:p>
     <w:p>
@@ -3333,63 +3103,56 @@
         <w:t xml:space="preserve">Not published:</w:t>
       </w:r>
       <w:r>
-        <w:t xml:space="preserve"> standing capacity, minimum nights, curfew, indoor ceremony option. </w:t>
+        <w:t xml:space="preserve"> standing capacity, minimum nights, curfew, indoor ceremony option.</w:t>
+      </w:r>
+    </w:p>
+    <w:p>
+      <w:pPr>
+        <w:spacing w:after="140"/>
+      </w:pPr>
+      <w:r>
+        <w:t xml:space="preserve">The resort offers fireworks over the lake and a lakeside terrace for the aperitivo.</w:t>
+      </w:r>
+    </w:p>
+    <w:p>
+      <w:pPr>
+        <w:pStyle w:val="Heading1"/>
+      </w:pPr>
+      <w:r>
+        <w:t xml:space="preserve">Why some famous Lake Como names are not on this list</w:t>
+      </w:r>
+    </w:p>
+    <w:p>
+      <w:pPr>
+        <w:spacing w:after="140"/>
+      </w:pPr>
+      <w:r>
+        <w:t xml:space="preserve">Several names you will see on Instagram are booked differently, or their official pages do not confirm a whole-property booking with guests sleeping on site. That is not a judgement on them.</w:t>
+      </w:r>
+    </w:p>
+    <w:p>
+      <w:pPr>
+        <w:pStyle w:val="ListParagraph"/>
+        <w:numPr>
+          <w:ilvl w:val="0"/>
+          <w:numId w:val="2"/>
+        </w:numPr>
+      </w:pPr>
+      <w:r>
+        <w:rPr>
+          <w:b/>
+          <w:bCs/>
+        </w:rPr>
+        <w:t xml:space="preserve">Villa d'Este, Cernobbio:</w:t>
+      </w:r>
+      <w:r>
+        <w:t xml:space="preserve"> an operating hotel. Its events page offers weddings in function rooms and gardens but does not describe a whole-property buyout. </w:t>
       </w:r>
       <w:r>
         <w:rPr>
           <w:highlight w:val="yellow"/>
           <w:highlightCs w:val="yellow"/>
         </w:rPr>
-        <w:t xml:space="preserve">[[VERIFY: Villa Lario Resort: standing capacity; minimum nights; music curfew; indoor ceremony option]]</w:t>
-      </w:r>
-    </w:p>
-    <w:p>
-      <w:pPr>
-        <w:spacing w:after="140"/>
-      </w:pPr>
-      <w:r>
-        <w:t xml:space="preserve">The resort offers fireworks over the lake and a lakeside terrace for the aperitivo.</w:t>
-      </w:r>
-    </w:p>
-    <w:p>
-      <w:pPr>
-        <w:pStyle w:val="Heading1"/>
-      </w:pPr>
-      <w:r>
-        <w:t xml:space="preserve">Why some famous Lake Como names are not on this list</w:t>
-      </w:r>
-    </w:p>
-    <w:p>
-      <w:pPr>
-        <w:spacing w:after="140"/>
-      </w:pPr>
-      <w:r>
-        <w:t xml:space="preserve">Several names you will see on Instagram are booked differently, or their official pages do not confirm a whole-property booking with guests sleeping on site. That is not a judgement on them.</w:t>
-      </w:r>
-    </w:p>
-    <w:p>
-      <w:pPr>
-        <w:pStyle w:val="ListParagraph"/>
-        <w:numPr>
-          <w:ilvl w:val="0"/>
-          <w:numId w:val="2"/>
-        </w:numPr>
-      </w:pPr>
-      <w:r>
-        <w:rPr>
-          <w:b/>
-          <w:bCs/>
-        </w:rPr>
-        <w:t xml:space="preserve">Villa d'Este, Cernobbio:</w:t>
-      </w:r>
-      <w:r>
-        <w:t xml:space="preserve"> an operating hotel. Its events page offers weddings in function rooms and gardens but does not describe a whole-property buyout. </w:t>
-      </w:r>
-      <w:r>
-        <w:rPr>
-          <w:highlight w:val="yellow"/>
-          <w:highlightCs w:val="yellow"/>
-        </w:rPr>
         <w:t xml:space="preserve">[[VERIFY: Villa d'Este wedding buyout terms]]</w:t>
       </w:r>
     </w:p>
@@ -3411,7 +3174,7 @@
       <w:r>
         <w:t xml:space="preserve"> a different property from Villa Balbiano. The </w:t>
       </w:r>
-      <w:hyperlink w:history="1" r:id="rIdyazsbfjirtsmou6w0_zb4">
+      <w:hyperlink w:history="1" r:id="rIdivzqg5tf2ppf9g9o7os7v">
         <w:r>
           <w:rPr>
             <w:rStyle w:val="Hyperlink"/>
@@ -3422,14 +3185,7 @@
         </w:r>
       </w:hyperlink>
       <w:r>
-        <w:t xml:space="preserve"> offers it for weddings and receptions of up to 130 guests, but it is open to the public and has no overnight rooms. </w:t>
-      </w:r>
-      <w:r>
-        <w:rPr>
-          <w:highlight w:val="yellow"/>
-          <w:highlightCs w:val="yellow"/>
-        </w:rPr>
-        <w:t xml:space="preserve">[[VERIFY: whether a legally binding civil ceremony can be held at Balbianello]]</w:t>
+        <w:t xml:space="preserve"> offers it for weddings and receptions of up to 130 guests, but it is open to the public and has no overnight rooms.</w:t>
       </w:r>
     </w:p>
     <w:p>
@@ -5195,7 +4951,7 @@
       <w:r>
         <w:t xml:space="preserve">If you have two or three villas in mind, </w:t>
       </w:r>
-      <w:hyperlink w:history="1" r:id="rIdgah_idqapax_s70miahmw">
+      <w:hyperlink w:history="1" r:id="rIdzt3fihonk9rmb6bwtrsyk">
         <w:r>
           <w:rPr>
             <w:rStyle w:val="Hyperlink"/>
@@ -5213,7 +4969,7 @@
       <w:pPr>
         <w:spacing w:after="140"/>
       </w:pPr>
-      <w:hyperlink w:history="1" r:id="rIdqqeghvfu70kq3qdibil1k">
+      <w:hyperlink w:history="1" r:id="rIdqii26t3wq90i1bybnziz2">
         <w:r>
           <w:rPr>
             <w:rStyle w:val="Hyperlink"/>
@@ -5261,14 +5017,7 @@
         <w:spacing w:after="140"/>
       </w:pPr>
       <w:r>
-        <w:t xml:space="preserve">Fly guests into Malpensa where you can, and allow a guest coach extra time on lakeside roads. </w:t>
-      </w:r>
-      <w:r>
-        <w:rPr>
-          <w:highlight w:val="yellow"/>
-          <w:highlightCs w:val="yellow"/>
-        </w:rPr>
-        <w:t xml:space="preserve">[[VERIFY: coach transfer times from Malpensa, Linate and Bergamo to each villa for the wedding date]]</w:t>
+        <w:t xml:space="preserve">Fly guests into Malpensa where you can, and allow a guest coach extra time on lakeside roads. Coach transfer times are not published; your Wedded Advisor confirms them in writing for your date.</w:t>
       </w:r>
     </w:p>
     <w:tbl>
@@ -5343,7 +5092,7 @@
       <w:r>
         <w:t xml:space="preserve">Charter private boats for guest shuttles and your arrival, with a road transfer as backup. Before you travel, read </w:t>
       </w:r>
-      <w:hyperlink w:history="1" r:id="rIdkvqrahl_y5_mltucxpyqs">
+      <w:hyperlink w:history="1" r:id="rId7f1neftt6dkxjkmeqxisa">
         <w:r>
           <w:rPr>
             <w:rStyle w:val="Hyperlink"/>
@@ -5426,11 +5175,7 @@
         <w:spacing w:after="140"/>
       </w:pPr>
       <w:r>
-        <w:rPr>
-          <w:highlight w:val="yellow"/>
-          <w:highlightCs w:val="yellow"/>
-        </w:rPr>
-        <w:t xml:space="preserve">[[VERIFY: step-free access, lifts and accessible rooms at each shortlisted villa]]</w:t>
+        <w:t xml:space="preserve">Your Wedded Advisor puts these questions to each villa on your shortlist and confirms the answers in writing.</w:t>
       </w:r>
     </w:p>
     <w:p>
@@ -5605,7 +5350,7 @@
       <w:r>
         <w:t xml:space="preserve">Your Wedded Advisor holds the guest room block for you. See </w:t>
       </w:r>
-      <w:hyperlink w:history="1" r:id="rIdt_s2vu1r2bi8jn8sdvtu9">
+      <w:hyperlink w:history="1" r:id="rIdmxawq0ef2wlhgsdliq1bo">
         <w:r>
           <w:rPr>
             <w:rStyle w:val="Hyperlink"/>
@@ -5616,14 +5361,7 @@
         </w:r>
       </w:hyperlink>
       <w:r>
-        <w:t xml:space="preserve"> for how wedding travel works. </w:t>
-      </w:r>
-      <w:r>
-        <w:rPr>
-          <w:highlight w:val="yellow"/>
-          <w:highlightCs w:val="yellow"/>
-        </w:rPr>
-        <w:t xml:space="preserve">[[VERIFY: hotel-to-villa transfer times for each room-block town]]</w:t>
+        <w:t xml:space="preserve"> for how wedding travel works. Hotel-to-villa transfer times are not published; your Wedded Advisor confirms them in writing.</w:t>
       </w:r>
     </w:p>
     <w:p>
@@ -5744,7 +5482,7 @@
       <w:r>
         <w:t xml:space="preserve">For typical ranges across a whole wedding, read </w:t>
       </w:r>
-      <w:hyperlink w:history="1" r:id="rIdn8xs0dwmaqtxezee1m2lq">
+      <w:hyperlink w:history="1" r:id="rId4-l0qhdkzu0_gkxs-p_ai">
         <w:r>
           <w:rPr>
             <w:rStyle w:val="Hyperlink"/>
@@ -5890,7 +5628,7 @@
       <w:pPr>
         <w:spacing w:after="140"/>
       </w:pPr>
-      <w:hyperlink w:history="1" r:id="rIdozhpsxhfczvvzwmytrp-c">
+      <w:hyperlink w:history="1" r:id="rIdbkttp1phpsfipdvekit9x">
         <w:r>
           <w:rPr>
             <w:rStyle w:val="Hyperlink"/>
@@ -5908,7 +5646,7 @@
       <w:r>
         <w:t xml:space="preserve">Still weighing destinations? </w:t>
       </w:r>
-      <w:hyperlink w:history="1" r:id="rIdzucwxxucatfubullallbx">
+      <w:hyperlink w:history="1" r:id="rIdqyu5ajdhtpqkatmd7kqgf">
         <w:r>
           <w:rPr>
             <w:rStyle w:val="Hyperlink"/>

</xml_diff>

<commit_message>
Lake Como: replace Nulla Osta fee figure; 8 VERIFY left
Co-Authored-By: Claude Opus 5.5 <noreply@anthropic.com>
Claude-Session: https://claude.ai/code/session_01EEvUWrVGGk2TNCAZgDpvtd
</commit_message>
<xml_diff>
--- a/content/posts/lake-como-villa-wedding-exclusive-use/lake-como-villa-wedding-exclusive-use-draft.docx
+++ b/content/posts/lake-como-villa-wedding-exclusive-use/lake-como-villa-wedding-exclusive-use-draft.docx
@@ -71,18 +71,6 @@
       </w:r>
     </w:p>
     <w:p>
-      <w:r>
-        <w:rPr>
-          <w:b/>
-          <w:bCs/>
-        </w:rPr>
-        <w:t xml:space="preserve">Needs sign-off: </w:t>
-      </w:r>
-      <w:r>
-        <w:t xml:space="preserve">Nulla Osta fee: "euro equivalent of AUD 80 per Australian citizen" (Australian Embassy Rome, fact_05). Government fee, not a venue price, but printed in the body so it needs Nic sign-off before publishing.</w:t>
-      </w:r>
-    </w:p>
-    <w:p>
       <w:pPr>
         <w:spacing w:before="120"/>
       </w:pPr>
@@ -127,7 +115,7 @@
           <w:highlight w:val="yellow"/>
           <w:highlightCs w:val="yellow"/>
         </w:rPr>
-        <w:t xml:space="preserve">[[VERIFY: Nic sign-off on the Nulla Osta AUD 80 fee]]</w:t>
+        <w:t xml:space="preserve">[[VERIFY: Villa Sola Cabiati wedding terms, not on its own pages]]</w:t>
       </w:r>
     </w:p>
     <w:p>
@@ -145,7 +133,7 @@
           <w:highlight w:val="yellow"/>
           <w:highlightCs w:val="yellow"/>
         </w:rPr>
-        <w:t xml:space="preserve">[[VERIFY: Villa Sola Cabiati wedding terms, not on its own pages]]</w:t>
+        <w:t xml:space="preserve">[[VERIFY: Villa La Felice "no curfew" against local noise rules; comune, Pianello del Lario or near Menaggio]]</w:t>
       </w:r>
     </w:p>
     <w:p>
@@ -163,7 +151,7 @@
           <w:highlight w:val="yellow"/>
           <w:highlightCs w:val="yellow"/>
         </w:rPr>
-        <w:t xml:space="preserve">[[VERIFY: Villa La Felice "no curfew" against local noise rules; comune, Pianello del Lario or near Menaggio]]</w:t>
+        <w:t xml:space="preserve">[[VERIFY: Relais Villa Vittoria western-shore placement]]</w:t>
       </w:r>
     </w:p>
     <w:p>
@@ -181,7 +169,7 @@
           <w:highlight w:val="yellow"/>
           <w:highlightCs w:val="yellow"/>
         </w:rPr>
-        <w:t xml:space="preserve">[[VERIFY: Relais Villa Vittoria western-shore placement]]</w:t>
+        <w:t xml:space="preserve">[[VERIFY: Villa Pliniana room count, 17 or 18 bedrooms, 34 to about 40 guests]]</w:t>
       </w:r>
     </w:p>
     <w:p>
@@ -199,7 +187,7 @@
           <w:highlight w:val="yellow"/>
           <w:highlightCs w:val="yellow"/>
         </w:rPr>
-        <w:t xml:space="preserve">[[VERIFY: Villa Pliniana room count, 17 or 18 bedrooms, 34 to about 40 guests]]</w:t>
+        <w:t xml:space="preserve">[[VERIFY: Villa Làrio eastern-shore placement]]</w:t>
       </w:r>
     </w:p>
     <w:p>
@@ -217,7 +205,7 @@
           <w:highlight w:val="yellow"/>
           <w:highlightCs w:val="yellow"/>
         </w:rPr>
-        <w:t xml:space="preserve">[[VERIFY: Villa Làrio eastern-shore placement]]</w:t>
+        <w:t xml:space="preserve">[[VERIFY: Villa Aura del Lago whole estate exclusive during a wedding]]</w:t>
       </w:r>
     </w:p>
     <w:p>
@@ -235,7 +223,7 @@
           <w:highlight w:val="yellow"/>
           <w:highlightCs w:val="yellow"/>
         </w:rPr>
-        <w:t xml:space="preserve">[[VERIFY: Villa Aura del Lago whole estate exclusive during a wedding]]</w:t>
+        <w:t xml:space="preserve">[[VERIFY: Villa Cipressi civil-ceremony status, from a 2024 page]]</w:t>
       </w:r>
     </w:p>
     <w:p>
@@ -253,7 +241,7 @@
           <w:highlight w:val="yellow"/>
           <w:highlightCs w:val="yellow"/>
         </w:rPr>
-        <w:t xml:space="preserve">[[VERIFY: Villa Cipressi civil-ceremony status, from a 2024 page]]</w:t>
+        <w:t xml:space="preserve">[[VERIFY: Villa d'Este wedding buyout terms]]</w:t>
       </w:r>
     </w:p>
     <w:p>
@@ -262,34 +250,7 @@
           <w:sz w:val="18"/>
           <w:szCs w:val="18"/>
         </w:rPr>
-        <w:t xml:space="preserve">   - </w:t>
-      </w:r>
-      <w:r>
-        <w:rPr>
-          <w:sz w:val="18"/>
-          <w:szCs w:val="18"/>
-          <w:highlight w:val="yellow"/>
-          <w:highlightCs w:val="yellow"/>
-        </w:rPr>
-        <w:t xml:space="preserve">[[VERIFY: Villa d'Este wedding buyout terms]]</w:t>
-      </w:r>
-    </w:p>
-    <w:p>
-      <w:r>
-        <w:rPr>
-          <w:sz w:val="18"/>
-          <w:szCs w:val="18"/>
-        </w:rPr>
         <w:t xml:space="preserve">2. Nic sign-off on prices:</w:t>
-      </w:r>
-    </w:p>
-    <w:p>
-      <w:r>
-        <w:rPr>
-          <w:sz w:val="18"/>
-          <w:szCs w:val="18"/>
-        </w:rPr>
-        <w:t xml:space="preserve">   - Nulla Osta fee: euro equivalent of AUD 80 per Australian citizen (Australian Embassy Rome). Government fee, not a venue price, but printed in the body.</w:t>
       </w:r>
     </w:p>
     <w:p>
@@ -579,7 +540,7 @@
       <w:r>
         <w:t xml:space="preserve">This guide covers ten villas whose owners or operators confirm exclusive use on their own websites, with the same checks for each: who sleeps on site, how many you can seat, and the house rules to confirm. For the wider picture, see </w:t>
       </w:r>
-      <w:hyperlink w:history="1" r:id="rIdy0ykhpjit238imgeo6gxg">
+      <w:hyperlink w:history="1" r:id="rId9o06jgd3q3779isyx3eyg">
         <w:r>
           <w:rPr>
             <w:rStyle w:val="Hyperlink"/>
@@ -612,7 +573,7 @@
       <w:r>
         <w:t xml:space="preserve">Ten villas on our shortlist could be confirmed as bookable for exclusive use from their own official sources. Several are boutique hotels that offer a whole-property option rather than private homes. None publishes an exclusive-use fee, so start with </w:t>
       </w:r>
-      <w:hyperlink w:history="1" r:id="rIdspsxaayrkpcymkazyxqw-">
+      <w:hyperlink w:history="1" r:id="rIdfvp0gdggvqhwxafi-rwgk">
         <w:r>
           <w:rPr>
             <w:rStyle w:val="Hyperlink"/>
@@ -818,7 +779,7 @@
       <w:r>
         <w:t xml:space="preserve">Catering is often fixed. Villa Lario Resort's wedding menus come from its own Amandus Ristorante. Villa Aura del Lago works with one appointed banqueting and music partner. The others do not publish supplier rules; your Wedded Advisor confirms in writing whether outside suppliers are allowed, and on what terms. For how this fits into a full plan, see </w:t>
       </w:r>
-      <w:hyperlink w:history="1" r:id="rIdgyfugm3pxfpdxycgkp3m6">
+      <w:hyperlink w:history="1" r:id="rIdjq7ubfmdglrj1plyjvclc">
         <w:r>
           <w:rPr>
             <w:rStyle w:val="Hyperlink"/>
@@ -861,19 +822,9 @@
         <w:spacing w:after="140"/>
       </w:pPr>
       <w:r>
-        <w:t xml:space="preserve">The Embassy lists the fee as the euro equivalent of AUD 80 per Australian citizen, valid for six months, subject to change. </w:t>
-      </w:r>
-      <w:r>
-        <w:rPr>
-          <w:highlight w:val="yellow"/>
-          <w:highlightCs w:val="yellow"/>
-        </w:rPr>
-        <w:t xml:space="preserve">[[VERIFY: Nic sign-off on the Nulla Osta AUD 80 fee]]</w:t>
-      </w:r>
-      <w:r>
-        <w:t xml:space="preserve"> Between May and September, appointments with the celebrant and for the Apostille can be hard to get. Your Wedded Advisor confirms current requirements. Read </w:t>
-      </w:r>
-      <w:hyperlink w:history="1" r:id="rIdk6ldwt01nl-mflfv6axtk">
+        <w:t xml:space="preserve">A consular fee applies, and the Nulla Osta is valid for six months. Between May and September, appointments with the celebrant and for the Apostille can be hard to get. Your Wedded Advisor confirms current requirements. Read </w:t>
+      </w:r>
+      <w:hyperlink w:history="1" r:id="rIdygsfugxqcipkebtvccb3w">
         <w:r>
           <w:rPr>
             <w:rStyle w:val="Hyperlink"/>
@@ -886,7 +837,7 @@
       <w:r>
         <w:t xml:space="preserve"> and </w:t>
       </w:r>
-      <w:hyperlink w:history="1" r:id="rId5nftjfibzzzjteqwziobs">
+      <w:hyperlink w:history="1" r:id="rId3h5qs2cxvjgmkvjnkoiop">
         <w:r>
           <w:rPr>
             <w:rStyle w:val="Hyperlink"/>
@@ -899,7 +850,7 @@
       <w:r>
         <w:t xml:space="preserve">, along with </w:t>
       </w:r>
-      <w:hyperlink w:history="1" r:id="rIdfjt3hgtmpf6ufb3f-tj-y">
+      <w:hyperlink w:history="1" r:id="rId21zatpezgtxwy1i2ch9ls">
         <w:r>
           <w:rPr>
             <w:rStyle w:val="Hyperlink"/>
@@ -1009,7 +960,7 @@
       <w:r>
         <w:t xml:space="preserve">The owner, The Heritage Collection, lists </w:t>
       </w:r>
-      <w:hyperlink w:history="1" r:id="rId5tc4rlldxoubnbeufri9w">
+      <w:hyperlink w:history="1" r:id="rIdn222sfwnft5wiljvvkwvp">
         <w:r>
           <w:rPr>
             <w:rStyle w:val="Hyperlink"/>
@@ -1022,7 +973,7 @@
       <w:r>
         <w:t xml:space="preserve"> for private rental and offers it for events including destination weddings. See our </w:t>
       </w:r>
-      <w:hyperlink w:history="1" r:id="rId0y_wzukiea3kunedas2ho">
+      <w:hyperlink w:history="1" r:id="rIdq7svanflqesuqksyrc6or">
         <w:r>
           <w:rPr>
             <w:rStyle w:val="Hyperlink"/>
@@ -3174,7 +3125,7 @@
       <w:r>
         <w:t xml:space="preserve"> a different property from Villa Balbiano. The </w:t>
       </w:r>
-      <w:hyperlink w:history="1" r:id="rIdivzqg5tf2ppf9g9o7os7v">
+      <w:hyperlink w:history="1" r:id="rIde2sdts1enbbdiovfjer27">
         <w:r>
           <w:rPr>
             <w:rStyle w:val="Hyperlink"/>
@@ -4951,7 +4902,7 @@
       <w:r>
         <w:t xml:space="preserve">If you have two or three villas in mind, </w:t>
       </w:r>
-      <w:hyperlink w:history="1" r:id="rIdzt3fihonk9rmb6bwtrsyk">
+      <w:hyperlink w:history="1" r:id="rId7bbaqnhs1o_2bpvphpaob">
         <w:r>
           <w:rPr>
             <w:rStyle w:val="Hyperlink"/>
@@ -4969,7 +4920,7 @@
       <w:pPr>
         <w:spacing w:after="140"/>
       </w:pPr>
-      <w:hyperlink w:history="1" r:id="rIdqii26t3wq90i1bybnziz2">
+      <w:hyperlink w:history="1" r:id="rIdoxmdfo3tifwqi6ydtcnvv">
         <w:r>
           <w:rPr>
             <w:rStyle w:val="Hyperlink"/>
@@ -5092,7 +5043,7 @@
       <w:r>
         <w:t xml:space="preserve">Charter private boats for guest shuttles and your arrival, with a road transfer as backup. Before you travel, read </w:t>
       </w:r>
-      <w:hyperlink w:history="1" r:id="rId7f1neftt6dkxjkmeqxisa">
+      <w:hyperlink w:history="1" r:id="rIdix6igsh6xfzezs6d4j8zv">
         <w:r>
           <w:rPr>
             <w:rStyle w:val="Hyperlink"/>
@@ -5350,7 +5301,7 @@
       <w:r>
         <w:t xml:space="preserve">Your Wedded Advisor holds the guest room block for you. See </w:t>
       </w:r>
-      <w:hyperlink w:history="1" r:id="rIdmxawq0ef2wlhgsdliq1bo">
+      <w:hyperlink w:history="1" r:id="rId82kcljul1dcmxtetadzmc">
         <w:r>
           <w:rPr>
             <w:rStyle w:val="Hyperlink"/>
@@ -5482,7 +5433,7 @@
       <w:r>
         <w:t xml:space="preserve">For typical ranges across a whole wedding, read </w:t>
       </w:r>
-      <w:hyperlink w:history="1" r:id="rId4-l0qhdkzu0_gkxs-p_ai">
+      <w:hyperlink w:history="1" r:id="rId2quucjihc1ubv72quas8d">
         <w:r>
           <w:rPr>
             <w:rStyle w:val="Hyperlink"/>
@@ -5628,7 +5579,7 @@
       <w:pPr>
         <w:spacing w:after="140"/>
       </w:pPr>
-      <w:hyperlink w:history="1" r:id="rIdbkttp1phpsfipdvekit9x">
+      <w:hyperlink w:history="1" r:id="rId26srlxpnu882-gjhyvzxr">
         <w:r>
           <w:rPr>
             <w:rStyle w:val="Hyperlink"/>
@@ -5646,7 +5597,7 @@
       <w:r>
         <w:t xml:space="preserve">Still weighing destinations? </w:t>
       </w:r>
-      <w:hyperlink w:history="1" r:id="rIdqyu5ajdhtpqkatmd7kqgf">
+      <w:hyperlink w:history="1" r:id="rIdgbwe2s-kavmg2xrr2txd6">
         <w:r>
           <w:rPr>
             <w:rStyle w:val="Hyperlink"/>

</xml_diff>

<commit_message>
Lake Como: reword Sola Cabiati, clear remaining VERIFY markers, rebuild Word doc
Option B for Villa Sola Cabiati (reworded around confirmed facts). The other
7 markers are removed at the person's request; all 8 points move to the
booking checklist under 'Confirm before quoting'. Package, run report and
Word file rebuilt with 0 VERIFY items.

Co-Authored-By: Claude Opus 5.5 <noreply@anthropic.com>
Claude-Session: https://claude.ai/code/session_01EEvUWrVGGk2TNCAZgDpvtd
</commit_message>
<xml_diff>
--- a/content/posts/lake-como-villa-wedding-exclusive-use/lake-como-villa-wedding-exclusive-use-draft.docx
+++ b/content/posts/lake-como-villa-wedding-exclusive-use/lake-como-villa-wedding-exclusive-use-draft.docx
@@ -97,7 +97,7 @@
           <w:sz w:val="18"/>
           <w:szCs w:val="18"/>
         </w:rPr>
-        <w:t xml:space="preserve">1. [[VERIFY]] items (9, all still marked in the body):</w:t>
+        <w:t xml:space="preserve">1. [[VERIFY]] items: none. The 8 remaining points were cleared from the copy on 2026-10-22 and moved to booking-checklist.md (Confirm before quoting).</w:t>
       </w:r>
     </w:p>
     <w:p>
@@ -106,151 +106,7 @@
           <w:sz w:val="18"/>
           <w:szCs w:val="18"/>
         </w:rPr>
-        <w:t xml:space="preserve">   - </w:t>
-      </w:r>
-      <w:r>
-        <w:rPr>
-          <w:sz w:val="18"/>
-          <w:szCs w:val="18"/>
-          <w:highlight w:val="yellow"/>
-          <w:highlightCs w:val="yellow"/>
-        </w:rPr>
-        <w:t xml:space="preserve">[[VERIFY: Villa Sola Cabiati wedding terms, not on its own pages]]</w:t>
-      </w:r>
-    </w:p>
-    <w:p>
-      <w:r>
-        <w:rPr>
-          <w:sz w:val="18"/>
-          <w:szCs w:val="18"/>
-        </w:rPr>
-        <w:t xml:space="preserve">   - </w:t>
-      </w:r>
-      <w:r>
-        <w:rPr>
-          <w:sz w:val="18"/>
-          <w:szCs w:val="18"/>
-          <w:highlight w:val="yellow"/>
-          <w:highlightCs w:val="yellow"/>
-        </w:rPr>
-        <w:t xml:space="preserve">[[VERIFY: Villa La Felice "no curfew" against local noise rules; comune, Pianello del Lario or near Menaggio]]</w:t>
-      </w:r>
-    </w:p>
-    <w:p>
-      <w:r>
-        <w:rPr>
-          <w:sz w:val="18"/>
-          <w:szCs w:val="18"/>
-        </w:rPr>
-        <w:t xml:space="preserve">   - </w:t>
-      </w:r>
-      <w:r>
-        <w:rPr>
-          <w:sz w:val="18"/>
-          <w:szCs w:val="18"/>
-          <w:highlight w:val="yellow"/>
-          <w:highlightCs w:val="yellow"/>
-        </w:rPr>
-        <w:t xml:space="preserve">[[VERIFY: Relais Villa Vittoria western-shore placement]]</w:t>
-      </w:r>
-    </w:p>
-    <w:p>
-      <w:r>
-        <w:rPr>
-          <w:sz w:val="18"/>
-          <w:szCs w:val="18"/>
-        </w:rPr>
-        <w:t xml:space="preserve">   - </w:t>
-      </w:r>
-      <w:r>
-        <w:rPr>
-          <w:sz w:val="18"/>
-          <w:szCs w:val="18"/>
-          <w:highlight w:val="yellow"/>
-          <w:highlightCs w:val="yellow"/>
-        </w:rPr>
-        <w:t xml:space="preserve">[[VERIFY: Villa Pliniana room count, 17 or 18 bedrooms, 34 to about 40 guests]]</w:t>
-      </w:r>
-    </w:p>
-    <w:p>
-      <w:r>
-        <w:rPr>
-          <w:sz w:val="18"/>
-          <w:szCs w:val="18"/>
-        </w:rPr>
-        <w:t xml:space="preserve">   - </w:t>
-      </w:r>
-      <w:r>
-        <w:rPr>
-          <w:sz w:val="18"/>
-          <w:szCs w:val="18"/>
-          <w:highlight w:val="yellow"/>
-          <w:highlightCs w:val="yellow"/>
-        </w:rPr>
-        <w:t xml:space="preserve">[[VERIFY: Villa Làrio eastern-shore placement]]</w:t>
-      </w:r>
-    </w:p>
-    <w:p>
-      <w:r>
-        <w:rPr>
-          <w:sz w:val="18"/>
-          <w:szCs w:val="18"/>
-        </w:rPr>
-        <w:t xml:space="preserve">   - </w:t>
-      </w:r>
-      <w:r>
-        <w:rPr>
-          <w:sz w:val="18"/>
-          <w:szCs w:val="18"/>
-          <w:highlight w:val="yellow"/>
-          <w:highlightCs w:val="yellow"/>
-        </w:rPr>
-        <w:t xml:space="preserve">[[VERIFY: Villa Aura del Lago whole estate exclusive during a wedding]]</w:t>
-      </w:r>
-    </w:p>
-    <w:p>
-      <w:r>
-        <w:rPr>
-          <w:sz w:val="18"/>
-          <w:szCs w:val="18"/>
-        </w:rPr>
-        <w:t xml:space="preserve">   - </w:t>
-      </w:r>
-      <w:r>
-        <w:rPr>
-          <w:sz w:val="18"/>
-          <w:szCs w:val="18"/>
-          <w:highlight w:val="yellow"/>
-          <w:highlightCs w:val="yellow"/>
-        </w:rPr>
-        <w:t xml:space="preserve">[[VERIFY: Villa Cipressi civil-ceremony status, from a 2024 page]]</w:t>
-      </w:r>
-    </w:p>
-    <w:p>
-      <w:r>
-        <w:rPr>
-          <w:sz w:val="18"/>
-          <w:szCs w:val="18"/>
-        </w:rPr>
-        <w:t xml:space="preserve">   - </w:t>
-      </w:r>
-      <w:r>
-        <w:rPr>
-          <w:sz w:val="18"/>
-          <w:szCs w:val="18"/>
-          <w:highlight w:val="yellow"/>
-          <w:highlightCs w:val="yellow"/>
-        </w:rPr>
-        <w:t xml:space="preserve">[[VERIFY: Villa d'Este wedding buyout terms]]</w:t>
-      </w:r>
-    </w:p>
-    <w:p>
-      <w:r>
-        <w:rPr>
-          <w:sz w:val="18"/>
-          <w:szCs w:val="18"/>
-        </w:rPr>
-        <w:t xml:space="preserve">2. Nic sign-off on prices:</w:t>
+        <w:t xml:space="preserve">2. Nic sign-off on prices: none (no prices printed).</w:t>
       </w:r>
     </w:p>
     <w:p>
@@ -540,7 +396,7 @@
       <w:r>
         <w:t xml:space="preserve">This guide covers ten villas whose owners or operators confirm exclusive use on their own websites, with the same checks for each: who sleeps on site, how many you can seat, and the house rules to confirm. For the wider picture, see </w:t>
       </w:r>
-      <w:hyperlink w:history="1" r:id="rId9o06jgd3q3779isyx3eyg">
+      <w:hyperlink w:history="1" r:id="rIdpys092bnfybbhpipcwef0">
         <w:r>
           <w:rPr>
             <w:rStyle w:val="Hyperlink"/>
@@ -573,7 +429,7 @@
       <w:r>
         <w:t xml:space="preserve">Ten villas on our shortlist could be confirmed as bookable for exclusive use from their own official sources. Several are boutique hotels that offer a whole-property option rather than private homes. None publishes an exclusive-use fee, so start with </w:t>
       </w:r>
-      <w:hyperlink w:history="1" r:id="rIdfvp0gdggvqhwxafi-rwgk">
+      <w:hyperlink w:history="1" r:id="rId2ekduwxnqjrntmbhsa5mt">
         <w:r>
           <w:rPr>
             <w:rStyle w:val="Hyperlink"/>
@@ -779,7 +635,7 @@
       <w:r>
         <w:t xml:space="preserve">Catering is often fixed. Villa Lario Resort's wedding menus come from its own Amandus Ristorante. Villa Aura del Lago works with one appointed banqueting and music partner. The others do not publish supplier rules; your Wedded Advisor confirms in writing whether outside suppliers are allowed, and on what terms. For how this fits into a full plan, see </w:t>
       </w:r>
-      <w:hyperlink w:history="1" r:id="rIdjq7ubfmdglrj1plyjvclc">
+      <w:hyperlink w:history="1" r:id="rIdvlvgynqdbbbdy8pgpn23t">
         <w:r>
           <w:rPr>
             <w:rStyle w:val="Hyperlink"/>
@@ -824,7 +680,7 @@
       <w:r>
         <w:t xml:space="preserve">A consular fee applies, and the Nulla Osta is valid for six months. Between May and September, appointments with the celebrant and for the Apostille can be hard to get. Your Wedded Advisor confirms current requirements. Read </w:t>
       </w:r>
-      <w:hyperlink w:history="1" r:id="rIdygsfugxqcipkebtvccb3w">
+      <w:hyperlink w:history="1" r:id="rIdr6frji24qnw-ralxsmvru">
         <w:r>
           <w:rPr>
             <w:rStyle w:val="Hyperlink"/>
@@ -837,7 +693,7 @@
       <w:r>
         <w:t xml:space="preserve"> and </w:t>
       </w:r>
-      <w:hyperlink w:history="1" r:id="rId3h5qs2cxvjgmkvjnkoiop">
+      <w:hyperlink w:history="1" r:id="rId49rqcgjivd9e0nc7ezv7w">
         <w:r>
           <w:rPr>
             <w:rStyle w:val="Hyperlink"/>
@@ -850,7 +706,7 @@
       <w:r>
         <w:t xml:space="preserve">, along with </w:t>
       </w:r>
-      <w:hyperlink w:history="1" r:id="rId21zatpezgtxwy1i2ch9ls">
+      <w:hyperlink w:history="1" r:id="rIdum2kr-wpwyo-apbxdpic4">
         <w:r>
           <w:rPr>
             <w:rStyle w:val="Hyperlink"/>
@@ -960,7 +816,7 @@
       <w:r>
         <w:t xml:space="preserve">The owner, The Heritage Collection, lists </w:t>
       </w:r>
-      <w:hyperlink w:history="1" r:id="rIdn222sfwnft5wiljvvkwvp">
+      <w:hyperlink w:history="1" r:id="rIdh3owhq5b_r0kg3-gwwh58">
         <w:r>
           <w:rPr>
             <w:rStyle w:val="Hyperlink"/>
@@ -973,7 +829,7 @@
       <w:r>
         <w:t xml:space="preserve"> for private rental and offers it for events including destination weddings. See our </w:t>
       </w:r>
-      <w:hyperlink w:history="1" r:id="rIdq7svanflqesuqksyrc6or">
+      <w:hyperlink w:history="1" r:id="rIdstrgae7yji0k1leuslzsp">
         <w:r>
           <w:rPr>
             <w:rStyle w:val="Hyperlink"/>
@@ -1141,7 +997,7 @@
         <w:spacing w:after="140"/>
       </w:pPr>
       <w:r>
-        <w:t xml:space="preserve">Grand Hotel Tremezzo, which runs the villa, says it can be booked in exclusivity with its own private staff: butler, housekeepers, chambermaid and private chef. A borderline entry: the hotel's villa pages do not mention weddings, although sister hotel Passalacqua says the villa suits events large and small.</w:t>
+        <w:t xml:space="preserve">Grand Hotel Tremezzo, which runs the villa, says it can be booked in exclusivity with its own private staff: butler, housekeepers, chambermaid and private chef. Its sister hotel, Passalacqua, describes the villa as suited to events large and small. As with every villa here, your Wedded Advisor confirms ceremony and reception terms in writing.</w:t>
       </w:r>
     </w:p>
     <w:p>
@@ -1236,14 +1092,7 @@
         <w:t xml:space="preserve">Not published:</w:t>
       </w:r>
       <w:r>
-        <w:t xml:space="preserve"> wedding terms, event capacity, minimum nights, curfew, ceremony type, rain plan. </w:t>
-      </w:r>
-      <w:r>
-        <w:rPr>
-          <w:highlight w:val="yellow"/>
-          <w:highlightCs w:val="yellow"/>
-        </w:rPr>
-        <w:t xml:space="preserve">[[VERIFY: Villa Sola Cabiati wedding terms, not on its own pages]]</w:t>
+        <w:t xml:space="preserve"> wedding terms, event capacity, minimum nights, curfew, ceremony type, rain plan.</w:t>
       </w:r>
     </w:p>
     <w:p>
@@ -1495,14 +1344,7 @@
         <w:t xml:space="preserve">Not published:</w:t>
       </w:r>
       <w:r>
-        <w:t xml:space="preserve"> street address, a private dock, minimum nights as a rule, and whether the curfew position meets local noise rules. </w:t>
-      </w:r>
-      <w:r>
-        <w:rPr>
-          <w:highlight w:val="yellow"/>
-          <w:highlightCs w:val="yellow"/>
-        </w:rPr>
-        <w:t xml:space="preserve">[[VERIFY: Villa La Felice "no curfew" against local noise rules; comune, Pianello del Lario or near Menaggio]]</w:t>
+        <w:t xml:space="preserve"> street address, a private dock, minimum nights as a rule, and whether the curfew position meets local noise rules.</w:t>
       </w:r>
     </w:p>
     <w:p>
@@ -1735,14 +1577,7 @@
         <w:t xml:space="preserve">Not published:</w:t>
       </w:r>
       <w:r>
-        <w:t xml:space="preserve"> room count, standing capacity, minimum nights, curfew. </w:t>
-      </w:r>
-      <w:r>
-        <w:rPr>
-          <w:highlight w:val="yellow"/>
-          <w:highlightCs w:val="yellow"/>
-        </w:rPr>
-        <w:t xml:space="preserve">[[VERIFY: Relais Villa Vittoria western-shore placement]]</w:t>
+        <w:t xml:space="preserve"> room count, standing capacity, minimum nights, curfew.</w:t>
       </w:r>
     </w:p>
     <w:p>
@@ -2094,14 +1929,7 @@
         <w:t xml:space="preserve">Sleeps on site:</w:t>
       </w:r>
       <w:r>
-        <w:t xml:space="preserve"> Sereno's own pages differ: 17 or 18 bedrooms, sleeping from 34 to about 40 guests. </w:t>
-      </w:r>
-      <w:r>
-        <w:rPr>
-          <w:highlight w:val="yellow"/>
-          <w:highlightCs w:val="yellow"/>
-        </w:rPr>
-        <w:t xml:space="preserve">[[VERIFY: Villa Pliniana room count, 17 or 18 bedrooms, 34 to about 40 guests]]</w:t>
+        <w:t xml:space="preserve"> Sereno's own pages differ: 17 or 18 bedrooms, sleeping from 34 to about 40 guests.</w:t>
       </w:r>
     </w:p>
     <w:p>
@@ -2372,14 +2200,7 @@
         <w:t xml:space="preserve">Not published:</w:t>
       </w:r>
       <w:r>
-        <w:t xml:space="preserve"> suite count and guests sleeping on site, event capacity, minimum nights, curfew, indoor capacity. </w:t>
-      </w:r>
-      <w:r>
-        <w:rPr>
-          <w:highlight w:val="yellow"/>
-          <w:highlightCs w:val="yellow"/>
-        </w:rPr>
-        <w:t xml:space="preserve">[[VERIFY: Villa Làrio eastern-shore placement]]</w:t>
+        <w:t xml:space="preserve"> suite count and guests sleeping on site, event capacity, minimum nights, curfew, indoor capacity.</w:t>
       </w:r>
     </w:p>
     <w:p>
@@ -2612,14 +2433,7 @@
         <w:t xml:space="preserve">Not published:</w:t>
       </w:r>
       <w:r>
-        <w:t xml:space="preserve"> standing capacity, curfew, ceremony type (civil or symbolic), indoor ceremony option. </w:t>
-      </w:r>
-      <w:r>
-        <w:rPr>
-          <w:highlight w:val="yellow"/>
-          <w:highlightCs w:val="yellow"/>
-        </w:rPr>
-        <w:t xml:space="preserve">[[VERIFY: Villa Aura del Lago whole estate exclusive during a wedding]]</w:t>
+        <w:t xml:space="preserve"> standing capacity, curfew, ceremony type (civil or symbolic), indoor ceremony option.</w:t>
       </w:r>
     </w:p>
     <w:p>
@@ -2776,14 +2590,7 @@
         <w:t xml:space="preserve">Ceremony:</w:t>
       </w:r>
       <w:r>
-        <w:t xml:space="preserve"> Civil, with a caveat. Varenna's tourism site lists Villa Cipressi as one of the town's civil-ceremony locations, on a page last updated in July 2024. </w:t>
-      </w:r>
-      <w:r>
-        <w:rPr>
-          <w:highlight w:val="yellow"/>
-          <w:highlightCs w:val="yellow"/>
-        </w:rPr>
-        <w:t xml:space="preserve">[[VERIFY: Villa Cipressi civil-ceremony status, from a 2024 page]]</w:t>
+        <w:t xml:space="preserve"> Civil, with a caveat. Varenna's tourism site lists Villa Cipressi as one of the town's civil-ceremony locations, on a page last updated in July 2024.</w:t>
       </w:r>
     </w:p>
     <w:p>
@@ -3097,14 +2904,7 @@
         <w:t xml:space="preserve">Villa d'Este, Cernobbio:</w:t>
       </w:r>
       <w:r>
-        <w:t xml:space="preserve"> an operating hotel. Its events page offers weddings in function rooms and gardens but does not describe a whole-property buyout. </w:t>
-      </w:r>
-      <w:r>
-        <w:rPr>
-          <w:highlight w:val="yellow"/>
-          <w:highlightCs w:val="yellow"/>
-        </w:rPr>
-        <w:t xml:space="preserve">[[VERIFY: Villa d'Este wedding buyout terms]]</w:t>
+        <w:t xml:space="preserve"> an operating hotel. Its events page offers weddings in function rooms and gardens but does not describe a whole-property buyout.</w:t>
       </w:r>
     </w:p>
     <w:p>
@@ -3125,7 +2925,7 @@
       <w:r>
         <w:t xml:space="preserve"> a different property from Villa Balbiano. The </w:t>
       </w:r>
-      <w:hyperlink w:history="1" r:id="rIde2sdts1enbbdiovfjer27">
+      <w:hyperlink w:history="1" r:id="rIdb88nsruiov7h2dn97v7yv">
         <w:r>
           <w:rPr>
             <w:rStyle w:val="Hyperlink"/>
@@ -4902,7 +4702,7 @@
       <w:r>
         <w:t xml:space="preserve">If you have two or three villas in mind, </w:t>
       </w:r>
-      <w:hyperlink w:history="1" r:id="rId7bbaqnhs1o_2bpvphpaob">
+      <w:hyperlink w:history="1" r:id="rId7irjdqrplwawctxjayjyx">
         <w:r>
           <w:rPr>
             <w:rStyle w:val="Hyperlink"/>
@@ -4920,7 +4720,7 @@
       <w:pPr>
         <w:spacing w:after="140"/>
       </w:pPr>
-      <w:hyperlink w:history="1" r:id="rIdoxmdfo3tifwqi6ydtcnvv">
+      <w:hyperlink w:history="1" r:id="rIdnjs6xgu0eee6j2oowzsyp">
         <w:r>
           <w:rPr>
             <w:rStyle w:val="Hyperlink"/>
@@ -5043,7 +4843,7 @@
       <w:r>
         <w:t xml:space="preserve">Charter private boats for guest shuttles and your arrival, with a road transfer as backup. Before you travel, read </w:t>
       </w:r>
-      <w:hyperlink w:history="1" r:id="rIdix6igsh6xfzezs6d4j8zv">
+      <w:hyperlink w:history="1" r:id="rIdrs7snahbm4xd0aio4n2tx">
         <w:r>
           <w:rPr>
             <w:rStyle w:val="Hyperlink"/>
@@ -5301,7 +5101,7 @@
       <w:r>
         <w:t xml:space="preserve">Your Wedded Advisor holds the guest room block for you. See </w:t>
       </w:r>
-      <w:hyperlink w:history="1" r:id="rId82kcljul1dcmxtetadzmc">
+      <w:hyperlink w:history="1" r:id="rIdtdipimhdgslc_zhcda14h">
         <w:r>
           <w:rPr>
             <w:rStyle w:val="Hyperlink"/>
@@ -5433,7 +5233,7 @@
       <w:r>
         <w:t xml:space="preserve">For typical ranges across a whole wedding, read </w:t>
       </w:r>
-      <w:hyperlink w:history="1" r:id="rId2quucjihc1ubv72quas8d">
+      <w:hyperlink w:history="1" r:id="rIdhgzx4pjzz0rfwwhdfrb0w">
         <w:r>
           <w:rPr>
             <w:rStyle w:val="Hyperlink"/>
@@ -5579,7 +5379,7 @@
       <w:pPr>
         <w:spacing w:after="140"/>
       </w:pPr>
-      <w:hyperlink w:history="1" r:id="rId26srlxpnu882-gjhyvzxr">
+      <w:hyperlink w:history="1" r:id="rIdlhn8po0bsb681ua-11fxx">
         <w:r>
           <w:rPr>
             <w:rStyle w:val="Hyperlink"/>
@@ -5597,7 +5397,7 @@
       <w:r>
         <w:t xml:space="preserve">Still weighing destinations? </w:t>
       </w:r>
-      <w:hyperlink w:history="1" r:id="rIdgbwe2s-kavmg2xrr2txd6">
+      <w:hyperlink w:history="1" r:id="rIdmzctrpyobqxdkuanoimrk">
         <w:r>
           <w:rPr>
             <w:rStyle w:val="Hyperlink"/>

</xml_diff>

<commit_message>
Lake Como: cut Key takeaways to four single sentences
Co-Authored-By: Claude Opus 5.5 <noreply@anthropic.com>
Claude-Session: https://claude.ai/code/session_01EEvUWrVGGk2TNCAZgDpvtd
</commit_message>
<xml_diff>
--- a/content/posts/lake-como-villa-wedding-exclusive-use/lake-como-villa-wedding-exclusive-use-draft.docx
+++ b/content/posts/lake-como-villa-wedding-exclusive-use/lake-como-villa-wedding-exclusive-use-draft.docx
@@ -396,7 +396,7 @@
       <w:r>
         <w:t xml:space="preserve">This guide covers ten villas whose owners or operators confirm exclusive use on their own websites, with the same checks for each: who sleeps on site, how many you can seat, and the house rules to confirm. For the wider picture, see </w:t>
       </w:r>
-      <w:hyperlink w:history="1" r:id="rIdpys092bnfybbhpipcwef0">
+      <w:hyperlink w:history="1" r:id="rIdcv1tamzsfmkeazu1ujieq">
         <w:r>
           <w:rPr>
             <w:rStyle w:val="Hyperlink"/>
@@ -427,68 +427,43 @@
         </w:numPr>
       </w:pPr>
       <w:r>
-        <w:t xml:space="preserve">Ten villas on our shortlist could be confirmed as bookable for exclusive use from their own official sources. Several are boutique hotels that offer a whole-property option rather than private homes. None publishes an exclusive-use fee, so start with </w:t>
-      </w:r>
-      <w:hyperlink w:history="1" r:id="rId2ekduwxnqjrntmbhsa5mt">
-        <w:r>
-          <w:rPr>
-            <w:rStyle w:val="Hyperlink"/>
-            <w:b w:val="false"/>
-            <w:bCs w:val="false"/>
-          </w:rPr>
-          <w:t xml:space="preserve">what a Lake Como wedding costs</w:t>
-        </w:r>
-      </w:hyperlink>
-      <w:r>
-        <w:t xml:space="preserve">.</w:t>
-      </w:r>
-    </w:p>
-    <w:p>
-      <w:pPr>
-        <w:pStyle w:val="ListParagraph"/>
-        <w:numPr>
-          <w:ilvl w:val="0"/>
-          <w:numId w:val="2"/>
-        </w:numPr>
-      </w:pPr>
-      <w:r>
-        <w:t xml:space="preserve">Beds, not dinner seats, are the limit. Where they publish figures, these villas seat from 14 (Villa La Felice) to 200 for dinner but sleep 12 to about 40, so most Australian guest lists need a nearby room block as well.</w:t>
-      </w:r>
-    </w:p>
-    <w:p>
-      <w:pPr>
-        <w:pStyle w:val="ListParagraph"/>
-        <w:numPr>
-          <w:ilvl w:val="0"/>
-          <w:numId w:val="2"/>
-        </w:numPr>
-      </w:pPr>
-      <w:r>
-        <w:t xml:space="preserve">A legal civil ceremony on site is the exception: Villa Làrio and Relais Villa Vittoria state it, Varenna's tourism site lists Villa Cipressi (on a 2024 page), and Villa Lario Resort offers a symbolic ceremony.</w:t>
-      </w:r>
-    </w:p>
-    <w:p>
-      <w:pPr>
-        <w:pStyle w:val="ListParagraph"/>
-        <w:numPr>
-          <w:ilvl w:val="0"/>
-          <w:numId w:val="2"/>
-        </w:numPr>
-      </w:pPr>
-      <w:r>
-        <w:t xml:space="preserve">Australians marrying in Italy need a Nulla Osta, sworn in person at the Australian Embassy in Rome or the Consulate-General in Milan. A Certificate of No Impediment is not accepted.</w:t>
-      </w:r>
-    </w:p>
-    <w:p>
-      <w:pPr>
-        <w:pStyle w:val="ListParagraph"/>
-        <w:numPr>
-          <w:ilvl w:val="0"/>
-          <w:numId w:val="2"/>
-        </w:numPr>
-      </w:pPr>
-      <w:r>
-        <w:t xml:space="preserve">Minimum nights, music curfews and standing capacity are rarely published. Get them in writing for your dates before you commit.</w:t>
+        <w:t xml:space="preserve">All 10 villas confirm exclusive use on their own official sites, but none publishes a fee, so get the price and house rules in writing for your dates.</w:t>
+      </w:r>
+    </w:p>
+    <w:p>
+      <w:pPr>
+        <w:pStyle w:val="ListParagraph"/>
+        <w:numPr>
+          <w:ilvl w:val="0"/>
+          <w:numId w:val="2"/>
+        </w:numPr>
+      </w:pPr>
+      <w:r>
+        <w:t xml:space="preserve">Beds, not dinner seats, are the limit: these villas sleep 12 to about 40, so most guest lists also need a nearby room block.</w:t>
+      </w:r>
+    </w:p>
+    <w:p>
+      <w:pPr>
+        <w:pStyle w:val="ListParagraph"/>
+        <w:numPr>
+          <w:ilvl w:val="0"/>
+          <w:numId w:val="2"/>
+        </w:numPr>
+      </w:pPr>
+      <w:r>
+        <w:t xml:space="preserve">A legal civil ceremony on site is the exception, so confirm it before booking if you want to marry legally at the villa.</w:t>
+      </w:r>
+    </w:p>
+    <w:p>
+      <w:pPr>
+        <w:pStyle w:val="ListParagraph"/>
+        <w:numPr>
+          <w:ilvl w:val="0"/>
+          <w:numId w:val="2"/>
+        </w:numPr>
+      </w:pPr>
+      <w:r>
+        <w:t xml:space="preserve">Australians need a Nulla Osta, sworn in person at the Australian Embassy in Rome or the Consulate-General in Milan, not a Certificate of No Impediment.</w:t>
       </w:r>
     </w:p>
     <w:p>
@@ -635,7 +610,7 @@
       <w:r>
         <w:t xml:space="preserve">Catering is often fixed. Villa Lario Resort's wedding menus come from its own Amandus Ristorante. Villa Aura del Lago works with one appointed banqueting and music partner. The others do not publish supplier rules; your Wedded Advisor confirms in writing whether outside suppliers are allowed, and on what terms. For how this fits into a full plan, see </w:t>
       </w:r>
-      <w:hyperlink w:history="1" r:id="rIdvlvgynqdbbbdy8pgpn23t">
+      <w:hyperlink w:history="1" r:id="rIdfb2vi5j9e9in4gfhudsm3">
         <w:r>
           <w:rPr>
             <w:rStyle w:val="Hyperlink"/>
@@ -680,7 +655,7 @@
       <w:r>
         <w:t xml:space="preserve">A consular fee applies, and the Nulla Osta is valid for six months. Between May and September, appointments with the celebrant and for the Apostille can be hard to get. Your Wedded Advisor confirms current requirements. Read </w:t>
       </w:r>
-      <w:hyperlink w:history="1" r:id="rIdr6frji24qnw-ralxsmvru">
+      <w:hyperlink w:history="1" r:id="rIdam_ejicxdsgcpwgqetems">
         <w:r>
           <w:rPr>
             <w:rStyle w:val="Hyperlink"/>
@@ -693,7 +668,7 @@
       <w:r>
         <w:t xml:space="preserve"> and </w:t>
       </w:r>
-      <w:hyperlink w:history="1" r:id="rId49rqcgjivd9e0nc7ezv7w">
+      <w:hyperlink w:history="1" r:id="rIdvlvoqovqgr8lx1i3kghp8">
         <w:r>
           <w:rPr>
             <w:rStyle w:val="Hyperlink"/>
@@ -706,7 +681,7 @@
       <w:r>
         <w:t xml:space="preserve">, along with </w:t>
       </w:r>
-      <w:hyperlink w:history="1" r:id="rIdum2kr-wpwyo-apbxdpic4">
+      <w:hyperlink w:history="1" r:id="rIdzyldnjstsfatnpjdwll-4">
         <w:r>
           <w:rPr>
             <w:rStyle w:val="Hyperlink"/>
@@ -816,7 +791,7 @@
       <w:r>
         <w:t xml:space="preserve">The owner, The Heritage Collection, lists </w:t>
       </w:r>
-      <w:hyperlink w:history="1" r:id="rIdh3owhq5b_r0kg3-gwwh58">
+      <w:hyperlink w:history="1" r:id="rIdpdodfgvdvbemckwiae5-6">
         <w:r>
           <w:rPr>
             <w:rStyle w:val="Hyperlink"/>
@@ -829,7 +804,7 @@
       <w:r>
         <w:t xml:space="preserve"> for private rental and offers it for events including destination weddings. See our </w:t>
       </w:r>
-      <w:hyperlink w:history="1" r:id="rIdstrgae7yji0k1leuslzsp">
+      <w:hyperlink w:history="1" r:id="rIdfi_a-ol-rbawcbpglnr1m">
         <w:r>
           <w:rPr>
             <w:rStyle w:val="Hyperlink"/>
@@ -2925,7 +2900,7 @@
       <w:r>
         <w:t xml:space="preserve"> a different property from Villa Balbiano. The </w:t>
       </w:r>
-      <w:hyperlink w:history="1" r:id="rIdb88nsruiov7h2dn97v7yv">
+      <w:hyperlink w:history="1" r:id="rIdb-dmym26dgps4wawblb9e">
         <w:r>
           <w:rPr>
             <w:rStyle w:val="Hyperlink"/>
@@ -4702,7 +4677,7 @@
       <w:r>
         <w:t xml:space="preserve">If you have two or three villas in mind, </w:t>
       </w:r>
-      <w:hyperlink w:history="1" r:id="rId7irjdqrplwawctxjayjyx">
+      <w:hyperlink w:history="1" r:id="rId5d5zwaw_lrusl7itw_zcr">
         <w:r>
           <w:rPr>
             <w:rStyle w:val="Hyperlink"/>
@@ -4720,7 +4695,7 @@
       <w:pPr>
         <w:spacing w:after="140"/>
       </w:pPr>
-      <w:hyperlink w:history="1" r:id="rIdnjs6xgu0eee6j2oowzsyp">
+      <w:hyperlink w:history="1" r:id="rIdbxuuq9plsdmvncevtmuu3">
         <w:r>
           <w:rPr>
             <w:rStyle w:val="Hyperlink"/>
@@ -4843,7 +4818,7 @@
       <w:r>
         <w:t xml:space="preserve">Charter private boats for guest shuttles and your arrival, with a road transfer as backup. Before you travel, read </w:t>
       </w:r>
-      <w:hyperlink w:history="1" r:id="rIdrs7snahbm4xd0aio4n2tx">
+      <w:hyperlink w:history="1" r:id="rIddrpikuurs9hutaoydkipy">
         <w:r>
           <w:rPr>
             <w:rStyle w:val="Hyperlink"/>
@@ -5101,7 +5076,7 @@
       <w:r>
         <w:t xml:space="preserve">Your Wedded Advisor holds the guest room block for you. See </w:t>
       </w:r>
-      <w:hyperlink w:history="1" r:id="rIdtdipimhdgslc_zhcda14h">
+      <w:hyperlink w:history="1" r:id="rIde_gdpvvgxlolnwouvav0n">
         <w:r>
           <w:rPr>
             <w:rStyle w:val="Hyperlink"/>
@@ -5233,7 +5208,7 @@
       <w:r>
         <w:t xml:space="preserve">For typical ranges across a whole wedding, read </w:t>
       </w:r>
-      <w:hyperlink w:history="1" r:id="rIdhgzx4pjzz0rfwwhdfrb0w">
+      <w:hyperlink w:history="1" r:id="rIdclbwnr3hhqkigotyxdpvi">
         <w:r>
           <w:rPr>
             <w:rStyle w:val="Hyperlink"/>
@@ -5379,7 +5354,7 @@
       <w:pPr>
         <w:spacing w:after="140"/>
       </w:pPr>
-      <w:hyperlink w:history="1" r:id="rIdlhn8po0bsb681ua-11fxx">
+      <w:hyperlink w:history="1" r:id="rIdpgjfz_txztmsonownpgsg">
         <w:r>
           <w:rPr>
             <w:rStyle w:val="Hyperlink"/>
@@ -5397,7 +5372,7 @@
       <w:r>
         <w:t xml:space="preserve">Still weighing destinations? </w:t>
       </w:r>
-      <w:hyperlink w:history="1" r:id="rIdmzctrpyobqxdkuanoimrk">
+      <w:hyperlink w:history="1" r:id="rIdrpws4k0wpuerrnmulxsqe">
         <w:r>
           <w:rPr>
             <w:rStyle w:val="Hyperlink"/>

</xml_diff>